<commit_message>
Simulation : version cible MATLAB R2025b
- charger_reference : readmatrix sous MATLAB (dlmread réservé à Octave)
- figures en fenêtre séparée (WindowStyle normal) : sous le bureau R2025,
  une figure ancrée ignore Position et fausse la taille des images exportées
- guide : pré-requis R2025b, captures d'animation par point d'arrêt sur
  l'état (méthode indépendante de l'agencement des menus)
- mémoire : version de MATLAB indiquée au chapitre 16

Co-Authored-By: Claude Opus 5.5 <noreply@anthropic.com>
Claude-Session: https://claude.ai/code/session_011f3VP4wcPxf7KecGedoGY8
</commit_message>
<xml_diff>
--- a/docs/memoire/Commande_Sechoir_Solaire_Hybride.docx
+++ b/docs/memoire/Commande_Sechoir_Solaire_Hybride.docx
@@ -32573,7 +32573,7 @@
                 <w:sz w:val="19"/>
                 <w:szCs w:val="19"/>
               </w:rPr>
-              <w:t xml:space="preserve">MATLAB, Simulink, Stateflow</w:t>
+              <w:t xml:space="preserve">MATLAB, Simulink, Stateflow (R2025b)</w:t>
             </w:r>
           </w:p>
         </w:tc>
@@ -33432,7 +33432,7 @@
       <w:r>
         <w:t xml:space="preserve"> </w:t>
       </w:r>
-      <w:hyperlink w:history="1" r:id="rIdak4ypzcs9kgke8wkwhvzh">
+      <w:hyperlink w:history="1" r:id="rId-xdyuhvxjakqr5izu_cng">
         <w:r>
           <w:rPr>
             <w:rStyle w:val="Hyperlink"/>
@@ -33472,7 +33472,7 @@
       <w:r>
         <w:t xml:space="preserve"> </w:t>
       </w:r>
-      <w:hyperlink w:history="1" r:id="rIdwlly-rua1tddx5vjnqbsz">
+      <w:hyperlink w:history="1" r:id="rIdt8-xkrb8l4at78vg1qhrp">
         <w:r>
           <w:rPr>
             <w:rStyle w:val="Hyperlink"/>
@@ -33512,7 +33512,7 @@
       <w:r>
         <w:t xml:space="preserve"> </w:t>
       </w:r>
-      <w:hyperlink w:history="1" r:id="rIdqsbhkhwk8l9of99pzepzu">
+      <w:hyperlink w:history="1" r:id="rIdqej-0jwxbrh8vo3l3x23_">
         <w:r>
           <w:rPr>
             <w:rStyle w:val="Hyperlink"/>
@@ -33552,7 +33552,7 @@
       <w:r>
         <w:t xml:space="preserve"> </w:t>
       </w:r>
-      <w:hyperlink w:history="1" r:id="rId6ftf6p0fusfhs1xt63sbp">
+      <w:hyperlink w:history="1" r:id="rIdkonpv6qhmbqcld9rsbbb-">
         <w:r>
           <w:rPr>
             <w:rStyle w:val="Hyperlink"/>
@@ -33592,7 +33592,7 @@
       <w:r>
         <w:t xml:space="preserve"> </w:t>
       </w:r>
-      <w:hyperlink w:history="1" r:id="rIdso18jkwsv6b3_cg9hm0yc">
+      <w:hyperlink w:history="1" r:id="rIdvlipn36xgn44kz1r32zk2">
         <w:r>
           <w:rPr>
             <w:rStyle w:val="Hyperlink"/>
@@ -33632,7 +33632,7 @@
       <w:r>
         <w:t xml:space="preserve"> </w:t>
       </w:r>
-      <w:hyperlink w:history="1" r:id="rId4csopp1t9fozsxa4awrrq">
+      <w:hyperlink w:history="1" r:id="rIdk1vjju55jv3lffuwpiosz">
         <w:r>
           <w:rPr>
             <w:rStyle w:val="Hyperlink"/>
@@ -33672,7 +33672,7 @@
       <w:r>
         <w:t xml:space="preserve"> </w:t>
       </w:r>
-      <w:hyperlink w:history="1" r:id="rId1b9plumh_ow1suqye3anw">
+      <w:hyperlink w:history="1" r:id="rIdgkv1froxgorid6yieo8_i">
         <w:r>
           <w:rPr>
             <w:rStyle w:val="Hyperlink"/>
@@ -33712,7 +33712,7 @@
       <w:r>
         <w:t xml:space="preserve"> </w:t>
       </w:r>
-      <w:hyperlink w:history="1" r:id="rIdzgrqn5n5davzofercrrnt">
+      <w:hyperlink w:history="1" r:id="rIdeadaay2vjtqzfnzwqyc9s">
         <w:r>
           <w:rPr>
             <w:rStyle w:val="Hyperlink"/>
@@ -33752,7 +33752,7 @@
       <w:r>
         <w:t xml:space="preserve"> </w:t>
       </w:r>
-      <w:hyperlink w:history="1" r:id="rIdwi6fxemogscetculhq71c">
+      <w:hyperlink w:history="1" r:id="rId5457avuvu8kv5-wst8fy7">
         <w:r>
           <w:rPr>
             <w:rStyle w:val="Hyperlink"/>
@@ -33802,7 +33802,7 @@
       <w:r>
         <w:t xml:space="preserve"> </w:t>
       </w:r>
-      <w:hyperlink w:history="1" r:id="rIds-chj6tzo1jobo2eq4w07">
+      <w:hyperlink w:history="1" r:id="rIdjruabspiobwkhcok6qwt4">
         <w:r>
           <w:rPr>
             <w:rStyle w:val="Hyperlink"/>
@@ -33842,7 +33842,7 @@
       <w:r>
         <w:t xml:space="preserve"> </w:t>
       </w:r>
-      <w:hyperlink w:history="1" r:id="rId0cungklxyb3haf5usyh88">
+      <w:hyperlink w:history="1" r:id="rId5nwvqhtoa-wq3o3ijf4cn">
         <w:r>
           <w:rPr>
             <w:rStyle w:val="Hyperlink"/>
@@ -33882,7 +33882,7 @@
       <w:r>
         <w:t xml:space="preserve"> </w:t>
       </w:r>
-      <w:hyperlink w:history="1" r:id="rIdqui4ztzcsfou0j2csqqwv">
+      <w:hyperlink w:history="1" r:id="rId-8pmxggyajxwrxqn2rjyp">
         <w:r>
           <w:rPr>
             <w:rStyle w:val="Hyperlink"/>
@@ -33912,7 +33912,7 @@
       <w:r>
         <w:t xml:space="preserve"> </w:t>
       </w:r>
-      <w:hyperlink w:history="1" r:id="rIdm-h8jygwvgdjopmakeamq">
+      <w:hyperlink w:history="1" r:id="rId4bradq4lp84wes6_54itt">
         <w:r>
           <w:rPr>
             <w:rStyle w:val="Hyperlink"/>
@@ -34006,7 +34006,7 @@
       <w:r>
         <w:t xml:space="preserve"> </w:t>
       </w:r>
-      <w:hyperlink w:history="1" r:id="rIdsaksq-eqkhu7osxyx6rxi">
+      <w:hyperlink w:history="1" r:id="rId8ftu2_wudsw09b5knv1vy">
         <w:r>
           <w:rPr>
             <w:rStyle w:val="Hyperlink"/>
@@ -34046,7 +34046,7 @@
       <w:r>
         <w:t xml:space="preserve"> </w:t>
       </w:r>
-      <w:hyperlink w:history="1" r:id="rId723rophku48q0tp09smra">
+      <w:hyperlink w:history="1" r:id="rIdhn5jlg-pbakc1uddifgnt">
         <w:r>
           <w:rPr>
             <w:rStyle w:val="Hyperlink"/>
@@ -34086,7 +34086,7 @@
       <w:r>
         <w:t xml:space="preserve"> </w:t>
       </w:r>
-      <w:hyperlink w:history="1" r:id="rId7hfxftq4l3jwrpikgbpco">
+      <w:hyperlink w:history="1" r:id="rIdbgupyeslzzfjgtg9zuisc">
         <w:r>
           <w:rPr>
             <w:rStyle w:val="Hyperlink"/>
@@ -34116,7 +34116,7 @@
       <w:r>
         <w:t xml:space="preserve"> </w:t>
       </w:r>
-      <w:hyperlink w:history="1" r:id="rIdu2pwpzek3lj3othj8i5-g">
+      <w:hyperlink w:history="1" r:id="rIdwds091xkk_nkje0nkwqvh">
         <w:r>
           <w:rPr>
             <w:rStyle w:val="Hyperlink"/>
@@ -34146,7 +34146,7 @@
       <w:r>
         <w:t xml:space="preserve"> </w:t>
       </w:r>
-      <w:hyperlink w:history="1" r:id="rIdtajbnsxentwkfpdy_cvft">
+      <w:hyperlink w:history="1" r:id="rId8nmdazuout8yfd_heu99m">
         <w:r>
           <w:rPr>
             <w:rStyle w:val="Hyperlink"/>
@@ -34176,7 +34176,7 @@
       <w:r>
         <w:t xml:space="preserve"> </w:t>
       </w:r>
-      <w:hyperlink w:history="1" r:id="rIdjc_lqx_2nuwxy5fkavvp3">
+      <w:hyperlink w:history="1" r:id="rIdq8u7d7-zmrfhc6agcknsp">
         <w:r>
           <w:rPr>
             <w:rStyle w:val="Hyperlink"/>
@@ -34206,7 +34206,7 @@
       <w:r>
         <w:t xml:space="preserve"> </w:t>
       </w:r>
-      <w:hyperlink w:history="1" r:id="rIdrvyhzvmahsrsibnymlpuy">
+      <w:hyperlink w:history="1" r:id="rId0kptuohrbvff0gs_qa9a6">
         <w:r>
           <w:rPr>
             <w:rStyle w:val="Hyperlink"/>
@@ -34246,7 +34246,7 @@
       <w:r>
         <w:t xml:space="preserve"> </w:t>
       </w:r>
-      <w:hyperlink w:history="1" r:id="rIddyfaghzyrbiuichew2x_r">
+      <w:hyperlink w:history="1" r:id="rIdqgxg86veftzzudblopgdh">
         <w:r>
           <w:rPr>
             <w:rStyle w:val="Hyperlink"/>
@@ -34276,7 +34276,7 @@
       <w:r>
         <w:t xml:space="preserve"> </w:t>
       </w:r>
-      <w:hyperlink w:history="1" r:id="rIdsmmyazyh8mtq1clzfryin">
+      <w:hyperlink w:history="1" r:id="rId8h3xhsamgunmgqcxfo7rl">
         <w:r>
           <w:rPr>
             <w:rStyle w:val="Hyperlink"/>
@@ -34306,7 +34306,7 @@
       <w:r>
         <w:t xml:space="preserve"> </w:t>
       </w:r>
-      <w:hyperlink w:history="1" r:id="rIdghke7ct1muymkojuuchrm">
+      <w:hyperlink w:history="1" r:id="rIdap-g5oah8c63nrzfnro3m">
         <w:r>
           <w:rPr>
             <w:rStyle w:val="Hyperlink"/>
@@ -34336,7 +34336,7 @@
       <w:r>
         <w:t xml:space="preserve"> </w:t>
       </w:r>
-      <w:hyperlink w:history="1" r:id="rIdeuzvqfblq0r4ctlpnejia">
+      <w:hyperlink w:history="1" r:id="rIda0wz6pwg-pqhvzzcdpvns">
         <w:r>
           <w:rPr>
             <w:rStyle w:val="Hyperlink"/>
@@ -34366,7 +34366,7 @@
       <w:r>
         <w:t xml:space="preserve"> </w:t>
       </w:r>
-      <w:hyperlink w:history="1" r:id="rIdy-mfzyfhp0qdbf1khmquv">
+      <w:hyperlink w:history="1" r:id="rIdrj4brhsynaspceqpjxe4k">
         <w:r>
           <w:rPr>
             <w:rStyle w:val="Hyperlink"/>
@@ -34396,7 +34396,7 @@
       <w:r>
         <w:t xml:space="preserve"> </w:t>
       </w:r>
-      <w:hyperlink w:history="1" r:id="rIdy4gm6jcfdxpkwghua7mss">
+      <w:hyperlink w:history="1" r:id="rIdx0jgw8ucnwk0e7agqosom">
         <w:r>
           <w:rPr>
             <w:rStyle w:val="Hyperlink"/>
@@ -34426,7 +34426,7 @@
       <w:r>
         <w:t xml:space="preserve"> </w:t>
       </w:r>
-      <w:hyperlink w:history="1" r:id="rIdikhwmo1ueqdt4lxto4xio">
+      <w:hyperlink w:history="1" r:id="rIdl_hlfxs7puucjqgbz8wbo">
         <w:r>
           <w:rPr>
             <w:rStyle w:val="Hyperlink"/>
@@ -34456,7 +34456,7 @@
       <w:r>
         <w:t xml:space="preserve"> </w:t>
       </w:r>
-      <w:hyperlink w:history="1" r:id="rId2mrt7r8u4e8hv5d5ifhp9">
+      <w:hyperlink w:history="1" r:id="rIdbhuruuxww330jo-fhqe_z">
         <w:r>
           <w:rPr>
             <w:rStyle w:val="Hyperlink"/>
@@ -34486,7 +34486,7 @@
       <w:r>
         <w:t xml:space="preserve"> </w:t>
       </w:r>
-      <w:hyperlink w:history="1" r:id="rId5f-gkjhroasbplbxyarqs">
+      <w:hyperlink w:history="1" r:id="rId9n_jax8va-368nx6qv7nl">
         <w:r>
           <w:rPr>
             <w:rStyle w:val="Hyperlink"/>
@@ -34526,7 +34526,7 @@
       <w:r>
         <w:t xml:space="preserve"> </w:t>
       </w:r>
-      <w:hyperlink w:history="1" r:id="rIdl8llrh-indvhrwnd8dp3c">
+      <w:hyperlink w:history="1" r:id="rIdg5hwddq2rdx_vguactlyt">
         <w:r>
           <w:rPr>
             <w:rStyle w:val="Hyperlink"/>
@@ -34556,7 +34556,7 @@
       <w:r>
         <w:t xml:space="preserve"> </w:t>
       </w:r>
-      <w:hyperlink w:history="1" r:id="rIdzlcd5mtic27usfb9mu9p_">
+      <w:hyperlink w:history="1" r:id="rIdtigg1v_slolzaqkjiddxw">
         <w:r>
           <w:rPr>
             <w:rStyle w:val="Hyperlink"/>
@@ -34586,7 +34586,7 @@
       <w:r>
         <w:t xml:space="preserve"> </w:t>
       </w:r>
-      <w:hyperlink w:history="1" r:id="rId2ekzldy_l1rxhaidbh5q6">
+      <w:hyperlink w:history="1" r:id="rIdbsxvhzwyxdlmxzd0hu0uc">
         <w:r>
           <w:rPr>
             <w:rStyle w:val="Hyperlink"/>
@@ -34626,7 +34626,7 @@
       <w:r>
         <w:t xml:space="preserve"> </w:t>
       </w:r>
-      <w:hyperlink w:history="1" r:id="rId9cjx3vtq2pd2bnlihfvuq">
+      <w:hyperlink w:history="1" r:id="rIdstwotnnxaxligmh1ertoq">
         <w:r>
           <w:rPr>
             <w:rStyle w:val="Hyperlink"/>

</xml_diff>

<commit_message>
Modèle Simulink construit entièrement à partir de zéro (construire_modele)
À la demande de l'auteur, le .slx fourni n'est plus utilisé. construire_modele.m
crée un modèle neuf : chart Stateflow (89 données, 20 états créés chacun
directement dans son parent, transitions par défaut explicites, logique du
firmware v3), câblage des 21 entrées, conversion de puissance, modèle
thermique (Kth = 0,098 ; tau = 3530 s), séchage, brûleur, apport solaire,
scénarios, enregistrement, solveur ; compile et enregistre
Simulation_Sechoir_Hybride.slx.

- ancienne approche (completer_fsm_sechoir, preparer_simulation, .slx
  fournis) rangée dans matlab/ancien/
- scénarios : entrées d'origine inutilisées retirées (T_cap, H_initial,
  Btn_Prolongation)
- guide, README, FSM_SIMULINK.md et mémoire (chapitres 13 à 15) mis à jour

Co-Authored-By: Claude Opus 5.5 <noreply@anthropic.com>
Claude-Session: https://claude.ai/code/session_011f3VP4wcPxf7KecGedoGY8
</commit_message>
<xml_diff>
--- a/docs/memoire/Commande_Sechoir_Solaire_Hybride.docx
+++ b/docs/memoire/Commande_Sechoir_Solaire_Hybride.docx
@@ -24639,7 +24639,7 @@
                 <w:sz w:val="19"/>
                 <w:szCs w:val="19"/>
               </w:rPr>
-              <w:t xml:space="preserve">Commande_Sechoir_Hybride_corrige.slx</w:t>
+              <w:t xml:space="preserve">construire_modele.m</w:t>
             </w:r>
           </w:p>
         </w:tc>
@@ -24668,7 +24668,7 @@
                 <w:sz w:val="19"/>
                 <w:szCs w:val="19"/>
               </w:rPr>
-              <w:t xml:space="preserve">Modèle Simulink</w:t>
+              <w:t xml:space="preserve">Script MATLAB</w:t>
             </w:r>
           </w:p>
         </w:tc>
@@ -24697,7 +24697,7 @@
                 <w:sz w:val="19"/>
                 <w:szCs w:val="19"/>
               </w:rPr>
-              <w:t xml:space="preserve">Simulation : FSM + conversion de puissance + modèle thermique</w:t>
+              <w:t xml:space="preserve">Construit à partir de zéro le modèle Simulink : chart Stateflow identique au firmware, modèle physique, scénarios</w:t>
             </w:r>
           </w:p>
         </w:tc>
@@ -24731,7 +24731,7 @@
                 <w:sz w:val="19"/>
                 <w:szCs w:val="19"/>
               </w:rPr>
-              <w:t xml:space="preserve">completer_fsm_sechoir.m</w:t>
+              <w:t xml:space="preserve">Simulation_Sechoir_Hybride.slx</w:t>
             </w:r>
           </w:p>
         </w:tc>
@@ -24760,7 +24760,7 @@
                 <w:sz w:val="19"/>
                 <w:szCs w:val="19"/>
               </w:rPr>
-              <w:t xml:space="preserve">Script MATLAB</w:t>
+              <w:t xml:space="preserve">Modèle Simulink (généré)</w:t>
             </w:r>
           </w:p>
         </w:tc>
@@ -24789,7 +24789,7 @@
                 <w:sz w:val="19"/>
                 <w:szCs w:val="19"/>
               </w:rPr>
-              <w:t xml:space="preserve">Construit automatiquement le chart Stateflow à l'identique du firmware</w:t>
+              <w:t xml:space="preserve">Simulation en boucle fermée : FSM + puissance + thermique + séchage + brûleur</w:t>
             </w:r>
           </w:p>
         </w:tc>
@@ -26995,7 +26995,17 @@
         <w:jc w:val="both"/>
       </w:pPr>
       <w:r>
-        <w:t xml:space="preserve">Dans le modèle fourni, les ports du sous-système FSM n'étaient reliés ni au chart ni aux sorties : le chart ne recevait aucune entrée et aucune vanne ne pouvait s'ouvrir. Le script </w:t>
+        <w:t xml:space="preserve">Le modèle est </w:t>
+      </w:r>
+      <w:r>
+        <w:rPr>
+          <w:b/>
+          <w:bCs/>
+        </w:rPr>
+        <w:t xml:space="preserve">construit entièrement par script, à partir de zéro</w:t>
+      </w:r>
+      <w:r>
+        <w:t xml:space="preserve"> (</w:t>
       </w:r>
       <w:r>
         <w:rPr>
@@ -27004,20 +27014,22 @@
           <w:sz w:val="20"/>
           <w:szCs w:val="20"/>
         </w:rPr>
-        <w:t xml:space="preserve">preparer_simulation.m</w:t>
-      </w:r>
-      <w:r>
-        <w:t xml:space="preserve"> construit donc un modèle de simulation complet, </w:t>
-      </w:r>
-      <w:r>
-        <w:rPr>
-          <w:b/>
-          <w:bCs/>
-        </w:rPr>
-        <w:t xml:space="preserve">sans modifier le modèle d'origine</w:t>
-      </w:r>
-      <w:r>
-        <w:t xml:space="preserve">. Dans MATLAB, dossier </w:t>
+        <w:t xml:space="preserve">construire_modele.m</w:t>
+      </w:r>
+      <w:r>
+        <w:t xml:space="preserve">) : aucun fichier </w:t>
+      </w:r>
+      <w:r>
+        <w:rPr>
+          <w:rFonts w:ascii="Consolas" w:cs="Consolas" w:eastAsia="Consolas" w:hAnsi="Consolas"/>
+          <w:color w:val="1F3864"/>
+          <w:sz w:val="20"/>
+          <w:szCs w:val="20"/>
+        </w:rPr>
+        <w:t xml:space="preserve">.slx</w:t>
+      </w:r>
+      <w:r>
+        <w:t xml:space="preserve"> n'est édité à la main, et le modèle peut être reconstruit à l'identique à tout moment. Chaque état du chart est créé directement dans son parent, ce qui garantit la hiérarchie. Une première approche, qui complétait le modèle fourni au départ, a été abandonnée : ses ports n'étaient pas câblés et son chart ne comportait aucune transition par défaut. Dans MATLAB R2025b, dossier </w:t>
       </w:r>
       <w:r>
         <w:rPr>
@@ -27049,10 +27061,10 @@
           <w:sz w:val="20"/>
           <w:szCs w:val="20"/>
         </w:rPr>
-        <w:t xml:space="preserve">preparer_simulation</w:t>
-      </w:r>
-      <w:r>
-        <w:t xml:space="preserve"> : copie </w:t>
+        <w:t xml:space="preserve">construire_modele</w:t>
+      </w:r>
+      <w:r>
+        <w:t xml:space="preserve"> : crée </w:t>
       </w:r>
       <w:r>
         <w:rPr>
@@ -27061,34 +27073,10 @@
           <w:sz w:val="20"/>
           <w:szCs w:val="20"/>
         </w:rPr>
-        <w:t xml:space="preserve">Commande_Sechoir_Hybride_corrige.slx</w:t>
-      </w:r>
-      <w:r>
-        <w:t xml:space="preserve"> en </w:t>
-      </w:r>
-      <w:r>
-        <w:rPr>
-          <w:rFonts w:ascii="Consolas" w:cs="Consolas" w:eastAsia="Consolas" w:hAnsi="Consolas"/>
-          <w:color w:val="1F3864"/>
-          <w:sz w:val="20"/>
-          <w:szCs w:val="20"/>
-        </w:rPr>
         <w:t xml:space="preserve">Simulation_Sechoir_Hybride.slx</w:t>
       </w:r>
       <w:r>
-        <w:t xml:space="preserve">, complète le chart (</w:t>
-      </w:r>
-      <w:r>
-        <w:rPr>
-          <w:rFonts w:ascii="Consolas" w:cs="Consolas" w:eastAsia="Consolas" w:hAnsi="Consolas"/>
-          <w:color w:val="1F3864"/>
-          <w:sz w:val="20"/>
-          <w:szCs w:val="20"/>
-        </w:rPr>
-        <w:t xml:space="preserve">completer_fsm_sechoir</w:t>
-      </w:r>
-      <w:r>
-        <w:t xml:space="preserve">), câble ses 24 entrées, ajoute le brûleur, le séchage, l'apport solaire, les scénarios et l'enregistrement, règle le solveur, puis compile le modèle.</w:t>
+        <w:t xml:space="preserve"> — chart Stateflow (89 données, 20 états, transitions du firmware), câblage de ses 21 entrées, conversion de puissance, modèle thermique, séchage, brûleur, apport solaire, scénarios et enregistrement — règle le solveur, puis compile le modèle.</w:t>
       </w:r>
     </w:p>
     <w:p>
@@ -27201,7 +27189,7 @@
         <w:pStyle w:val="Heading2"/>
       </w:pPr>
       <w:r>
-        <w:t xml:space="preserve">14.3 Réglages faits par preparer_simulation</w:t>
+        <w:t xml:space="preserve">14.3 Réglages faits par construire_modele</w:t>
       </w:r>
     </w:p>
     <w:tbl>
@@ -29832,19 +29820,7 @@
               <w:jc w:val="both"/>
             </w:pPr>
             <w:r>
-              <w:t xml:space="preserve">Le script </w:t>
-            </w:r>
-            <w:r>
-              <w:rPr>
-                <w:rFonts w:ascii="Consolas" w:cs="Consolas" w:eastAsia="Consolas" w:hAnsi="Consolas"/>
-                <w:color w:val="1F3864"/>
-                <w:sz w:val="20"/>
-                <w:szCs w:val="20"/>
-              </w:rPr>
-              <w:t xml:space="preserve">completer_fsm_sechoir.m</w:t>
-            </w:r>
-            <w:r>
-              <w:t xml:space="preserve"> n'a pas encore été exécuté dans une vraie session MATLAB. Sa syntaxe et celle des 37 libellés qu'il écrit dans le chart ont été vérifiées par analyse statique (chapitre 15), mais pas les appels à l'API Stateflow. Le premier essai doit être considéré comme une validation.</w:t>
+              <w:t xml:space="preserve">Les scripts ont été vérifiés par analyse statique (chapitre 15). Les premiers essais sous MATLAB R2025b ont validé la création des données, de la hiérarchie et des transitions ; la compilation et la simulation du modèle construit à partir de zéro sont à confirmer lors du premier essai complet.</w:t>
             </w:r>
           </w:p>
         </w:tc>
@@ -31576,7 +31552,7 @@
         <w:jc w:val="both"/>
       </w:pPr>
       <w:r>
-        <w:t xml:space="preserve">Sans MATLAB disponible, le script de construction et les 37 libellés qu'il génère (9 états, 28 transitions) ont été analysés par </w:t>
+        <w:t xml:space="preserve">Le script de construction et les libellés qu'il génère (actions des 20 états, conditions et actions des transitions) ont été analysés par </w:t>
       </w:r>
       <w:r>
         <w:rPr>
@@ -31586,7 +31562,19 @@
         <w:t xml:space="preserve">MISS_HIT</w:t>
       </w:r>
       <w:r>
-        <w:t xml:space="preserve"> [29], un analyseur statique du langage MATLAB : syntaxe correcte. Il a aussi été vérifié que chaque variable utilisée est déclarée et qu'aucune entrée n'est écrite.</w:t>
+        <w:t xml:space="preserve"> [29], un analyseur statique du langage MATLAB : syntaxe correcte. Il a aussi été vérifié que chaque variable utilisée est déclarée et qu'aucune entrée n'est écrite. Sous MATLAB R2025b, les premiers essais ont révélé deux problèmes, corrigés : une syntaxe d'appel refusée par cette version (</w:t>
+      </w:r>
+      <w:r>
+        <w:rPr>
+          <w:rFonts w:ascii="Consolas" w:cs="Consolas" w:eastAsia="Consolas" w:hAnsi="Consolas"/>
+          <w:color w:val="1F3864"/>
+          <w:sz w:val="20"/>
+          <w:szCs w:val="20"/>
+        </w:rPr>
+        <w:t xml:space="preserve">sfroot.find</w:t>
+      </w:r>
+      <w:r>
+        <w:t xml:space="preserve">), et l'absence de transition par défaut dans le chart d'origine — raison du passage à une construction complète à partir de zéro.</w:t>
       </w:r>
     </w:p>
     <w:p>
@@ -33432,7 +33420,7 @@
       <w:r>
         <w:t xml:space="preserve"> </w:t>
       </w:r>
-      <w:hyperlink w:history="1" r:id="rId-xdyuhvxjakqr5izu_cng">
+      <w:hyperlink w:history="1" r:id="rId6rnhr5p0ocosl7ra1hgby">
         <w:r>
           <w:rPr>
             <w:rStyle w:val="Hyperlink"/>
@@ -33472,7 +33460,7 @@
       <w:r>
         <w:t xml:space="preserve"> </w:t>
       </w:r>
-      <w:hyperlink w:history="1" r:id="rIdt8-xkrb8l4at78vg1qhrp">
+      <w:hyperlink w:history="1" r:id="rIdhx_12kbexpnlacjrrpu26">
         <w:r>
           <w:rPr>
             <w:rStyle w:val="Hyperlink"/>
@@ -33512,7 +33500,7 @@
       <w:r>
         <w:t xml:space="preserve"> </w:t>
       </w:r>
-      <w:hyperlink w:history="1" r:id="rIdqej-0jwxbrh8vo3l3x23_">
+      <w:hyperlink w:history="1" r:id="rIdlo3cqrz9gzrrfr2pn6fnr">
         <w:r>
           <w:rPr>
             <w:rStyle w:val="Hyperlink"/>
@@ -33552,7 +33540,7 @@
       <w:r>
         <w:t xml:space="preserve"> </w:t>
       </w:r>
-      <w:hyperlink w:history="1" r:id="rIdkonpv6qhmbqcld9rsbbb-">
+      <w:hyperlink w:history="1" r:id="rId9fnuujnzbyvnh67b5dhtc">
         <w:r>
           <w:rPr>
             <w:rStyle w:val="Hyperlink"/>
@@ -33592,7 +33580,7 @@
       <w:r>
         <w:t xml:space="preserve"> </w:t>
       </w:r>
-      <w:hyperlink w:history="1" r:id="rIdvlipn36xgn44kz1r32zk2">
+      <w:hyperlink w:history="1" r:id="rId3hx0vwxmb83xqp0r6-pnr">
         <w:r>
           <w:rPr>
             <w:rStyle w:val="Hyperlink"/>
@@ -33632,7 +33620,7 @@
       <w:r>
         <w:t xml:space="preserve"> </w:t>
       </w:r>
-      <w:hyperlink w:history="1" r:id="rIdk1vjju55jv3lffuwpiosz">
+      <w:hyperlink w:history="1" r:id="rIdwrbdfeqr_cijeexblplu2">
         <w:r>
           <w:rPr>
             <w:rStyle w:val="Hyperlink"/>
@@ -33672,7 +33660,7 @@
       <w:r>
         <w:t xml:space="preserve"> </w:t>
       </w:r>
-      <w:hyperlink w:history="1" r:id="rIdgkv1froxgorid6yieo8_i">
+      <w:hyperlink w:history="1" r:id="rIdc-lt2xd_dk313jvq1qs8a">
         <w:r>
           <w:rPr>
             <w:rStyle w:val="Hyperlink"/>
@@ -33712,7 +33700,7 @@
       <w:r>
         <w:t xml:space="preserve"> </w:t>
       </w:r>
-      <w:hyperlink w:history="1" r:id="rIdeadaay2vjtqzfnzwqyc9s">
+      <w:hyperlink w:history="1" r:id="rIdxrwmlovn10lumqxfm6rpu">
         <w:r>
           <w:rPr>
             <w:rStyle w:val="Hyperlink"/>
@@ -33752,7 +33740,7 @@
       <w:r>
         <w:t xml:space="preserve"> </w:t>
       </w:r>
-      <w:hyperlink w:history="1" r:id="rId5457avuvu8kv5-wst8fy7">
+      <w:hyperlink w:history="1" r:id="rIdckjhdgf8uz4io_mkpj6xe">
         <w:r>
           <w:rPr>
             <w:rStyle w:val="Hyperlink"/>
@@ -33802,7 +33790,7 @@
       <w:r>
         <w:t xml:space="preserve"> </w:t>
       </w:r>
-      <w:hyperlink w:history="1" r:id="rIdjruabspiobwkhcok6qwt4">
+      <w:hyperlink w:history="1" r:id="rIdh9adbvkspseit99ymkvv8">
         <w:r>
           <w:rPr>
             <w:rStyle w:val="Hyperlink"/>
@@ -33842,7 +33830,7 @@
       <w:r>
         <w:t xml:space="preserve"> </w:t>
       </w:r>
-      <w:hyperlink w:history="1" r:id="rId5nwvqhtoa-wq3o3ijf4cn">
+      <w:hyperlink w:history="1" r:id="rIdq3uryqqbf7hfvrdrxks7n">
         <w:r>
           <w:rPr>
             <w:rStyle w:val="Hyperlink"/>
@@ -33882,7 +33870,7 @@
       <w:r>
         <w:t xml:space="preserve"> </w:t>
       </w:r>
-      <w:hyperlink w:history="1" r:id="rId-8pmxggyajxwrxqn2rjyp">
+      <w:hyperlink w:history="1" r:id="rIdbs-nar0is6u1ntm_ejwqi">
         <w:r>
           <w:rPr>
             <w:rStyle w:val="Hyperlink"/>
@@ -33912,7 +33900,7 @@
       <w:r>
         <w:t xml:space="preserve"> </w:t>
       </w:r>
-      <w:hyperlink w:history="1" r:id="rId4bradq4lp84wes6_54itt">
+      <w:hyperlink w:history="1" r:id="rIdrmnyl5odgounzxzjbw1wp">
         <w:r>
           <w:rPr>
             <w:rStyle w:val="Hyperlink"/>
@@ -34006,7 +33994,7 @@
       <w:r>
         <w:t xml:space="preserve"> </w:t>
       </w:r>
-      <w:hyperlink w:history="1" r:id="rId8ftu2_wudsw09b5knv1vy">
+      <w:hyperlink w:history="1" r:id="rIdirycn7avpf4zj7legsddy">
         <w:r>
           <w:rPr>
             <w:rStyle w:val="Hyperlink"/>
@@ -34046,7 +34034,7 @@
       <w:r>
         <w:t xml:space="preserve"> </w:t>
       </w:r>
-      <w:hyperlink w:history="1" r:id="rIdhn5jlg-pbakc1uddifgnt">
+      <w:hyperlink w:history="1" r:id="rIdyc211yw5txa3fqrtgozou">
         <w:r>
           <w:rPr>
             <w:rStyle w:val="Hyperlink"/>
@@ -34086,7 +34074,7 @@
       <w:r>
         <w:t xml:space="preserve"> </w:t>
       </w:r>
-      <w:hyperlink w:history="1" r:id="rIdbgupyeslzzfjgtg9zuisc">
+      <w:hyperlink w:history="1" r:id="rIdbw_9hkhdcmyqk1ejij1ea">
         <w:r>
           <w:rPr>
             <w:rStyle w:val="Hyperlink"/>
@@ -34116,7 +34104,7 @@
       <w:r>
         <w:t xml:space="preserve"> </w:t>
       </w:r>
-      <w:hyperlink w:history="1" r:id="rIdwds091xkk_nkje0nkwqvh">
+      <w:hyperlink w:history="1" r:id="rIdaqffffdm_6k8xzhxcjea0">
         <w:r>
           <w:rPr>
             <w:rStyle w:val="Hyperlink"/>
@@ -34146,7 +34134,7 @@
       <w:r>
         <w:t xml:space="preserve"> </w:t>
       </w:r>
-      <w:hyperlink w:history="1" r:id="rId8nmdazuout8yfd_heu99m">
+      <w:hyperlink w:history="1" r:id="rIdbggkrs5wx5ecnnxa2qsj5">
         <w:r>
           <w:rPr>
             <w:rStyle w:val="Hyperlink"/>
@@ -34176,7 +34164,7 @@
       <w:r>
         <w:t xml:space="preserve"> </w:t>
       </w:r>
-      <w:hyperlink w:history="1" r:id="rIdq8u7d7-zmrfhc6agcknsp">
+      <w:hyperlink w:history="1" r:id="rId8clis-x_gg5wxwq0xdogp">
         <w:r>
           <w:rPr>
             <w:rStyle w:val="Hyperlink"/>
@@ -34206,7 +34194,7 @@
       <w:r>
         <w:t xml:space="preserve"> </w:t>
       </w:r>
-      <w:hyperlink w:history="1" r:id="rId0kptuohrbvff0gs_qa9a6">
+      <w:hyperlink w:history="1" r:id="rIdd_9svgl2xuyagwzfpiuqo">
         <w:r>
           <w:rPr>
             <w:rStyle w:val="Hyperlink"/>
@@ -34246,7 +34234,7 @@
       <w:r>
         <w:t xml:space="preserve"> </w:t>
       </w:r>
-      <w:hyperlink w:history="1" r:id="rIdqgxg86veftzzudblopgdh">
+      <w:hyperlink w:history="1" r:id="rIdh-ajpk1ar72jkn5x4mp81">
         <w:r>
           <w:rPr>
             <w:rStyle w:val="Hyperlink"/>
@@ -34276,7 +34264,7 @@
       <w:r>
         <w:t xml:space="preserve"> </w:t>
       </w:r>
-      <w:hyperlink w:history="1" r:id="rId8h3xhsamgunmgqcxfo7rl">
+      <w:hyperlink w:history="1" r:id="rIdsjqmnexqv22pzb23pppi4">
         <w:r>
           <w:rPr>
             <w:rStyle w:val="Hyperlink"/>
@@ -34306,7 +34294,7 @@
       <w:r>
         <w:t xml:space="preserve"> </w:t>
       </w:r>
-      <w:hyperlink w:history="1" r:id="rIdap-g5oah8c63nrzfnro3m">
+      <w:hyperlink w:history="1" r:id="rIda-od_abvfs9jtfw55s40j">
         <w:r>
           <w:rPr>
             <w:rStyle w:val="Hyperlink"/>
@@ -34336,7 +34324,7 @@
       <w:r>
         <w:t xml:space="preserve"> </w:t>
       </w:r>
-      <w:hyperlink w:history="1" r:id="rIda0wz6pwg-pqhvzzcdpvns">
+      <w:hyperlink w:history="1" r:id="rIdl9163azk9r-oigb1rnfdn">
         <w:r>
           <w:rPr>
             <w:rStyle w:val="Hyperlink"/>
@@ -34366,7 +34354,7 @@
       <w:r>
         <w:t xml:space="preserve"> </w:t>
       </w:r>
-      <w:hyperlink w:history="1" r:id="rIdrj4brhsynaspceqpjxe4k">
+      <w:hyperlink w:history="1" r:id="rIdlgccgwh3qchlt284w85qt">
         <w:r>
           <w:rPr>
             <w:rStyle w:val="Hyperlink"/>
@@ -34396,7 +34384,7 @@
       <w:r>
         <w:t xml:space="preserve"> </w:t>
       </w:r>
-      <w:hyperlink w:history="1" r:id="rIdx0jgw8ucnwk0e7agqosom">
+      <w:hyperlink w:history="1" r:id="rIdkzs-gvekwel66n0jt6bc4">
         <w:r>
           <w:rPr>
             <w:rStyle w:val="Hyperlink"/>
@@ -34426,7 +34414,7 @@
       <w:r>
         <w:t xml:space="preserve"> </w:t>
       </w:r>
-      <w:hyperlink w:history="1" r:id="rIdl_hlfxs7puucjqgbz8wbo">
+      <w:hyperlink w:history="1" r:id="rIdmfin2vce5ifnfkjsjdqba">
         <w:r>
           <w:rPr>
             <w:rStyle w:val="Hyperlink"/>
@@ -34456,7 +34444,7 @@
       <w:r>
         <w:t xml:space="preserve"> </w:t>
       </w:r>
-      <w:hyperlink w:history="1" r:id="rIdbhuruuxww330jo-fhqe_z">
+      <w:hyperlink w:history="1" r:id="rId4kgt3l-2s8xvnjxk9voa5">
         <w:r>
           <w:rPr>
             <w:rStyle w:val="Hyperlink"/>
@@ -34486,7 +34474,7 @@
       <w:r>
         <w:t xml:space="preserve"> </w:t>
       </w:r>
-      <w:hyperlink w:history="1" r:id="rId9n_jax8va-368nx6qv7nl">
+      <w:hyperlink w:history="1" r:id="rIdg1-pyvkxdqpcb5j1r83mf">
         <w:r>
           <w:rPr>
             <w:rStyle w:val="Hyperlink"/>
@@ -34526,7 +34514,7 @@
       <w:r>
         <w:t xml:space="preserve"> </w:t>
       </w:r>
-      <w:hyperlink w:history="1" r:id="rIdg5hwddq2rdx_vguactlyt">
+      <w:hyperlink w:history="1" r:id="rIdvbka4z8diglnxbexf9m5i">
         <w:r>
           <w:rPr>
             <w:rStyle w:val="Hyperlink"/>
@@ -34556,7 +34544,7 @@
       <w:r>
         <w:t xml:space="preserve"> </w:t>
       </w:r>
-      <w:hyperlink w:history="1" r:id="rIdtigg1v_slolzaqkjiddxw">
+      <w:hyperlink w:history="1" r:id="rIdtg2g0h_l_bq_ye25jdxuz">
         <w:r>
           <w:rPr>
             <w:rStyle w:val="Hyperlink"/>
@@ -34586,7 +34574,7 @@
       <w:r>
         <w:t xml:space="preserve"> </w:t>
       </w:r>
-      <w:hyperlink w:history="1" r:id="rIdbsxvhzwyxdlmxzd0hu0uc">
+      <w:hyperlink w:history="1" r:id="rId0s9ma9cfcaurgqyefvvvm">
         <w:r>
           <w:rPr>
             <w:rStyle w:val="Hyperlink"/>
@@ -34626,7 +34614,7 @@
       <w:r>
         <w:t xml:space="preserve"> </w:t>
       </w:r>
-      <w:hyperlink w:history="1" r:id="rIdstwotnnxaxligmh1ertoq">
+      <w:hyperlink w:history="1" r:id="rId0j8ldciivgtwrj2z15ix3">
         <w:r>
           <w:rPr>
             <w:rStyle w:val="Hyperlink"/>

</xml_diff>

<commit_message>
Documentation : le modèle construit à partir de zéro compile sous R2025b
Co-Authored-By: Claude Opus 5.5 <noreply@anthropic.com>
Claude-Session: https://claude.ai/code/session_011f3VP4wcPxf7KecGedoGY8
</commit_message>
<xml_diff>
--- a/docs/memoire/Commande_Sechoir_Solaire_Hybride.docx
+++ b/docs/memoire/Commande_Sechoir_Solaire_Hybride.docx
@@ -29820,7 +29820,17 @@
               <w:jc w:val="both"/>
             </w:pPr>
             <w:r>
-              <w:t xml:space="preserve">Les scripts ont été vérifiés par analyse statique (chapitre 15). Les premiers essais sous MATLAB R2025b ont validé la création des données, de la hiérarchie et des transitions ; la compilation et la simulation du modèle construit à partir de zéro sont à confirmer lors du premier essai complet.</w:t>
+              <w:t xml:space="preserve">Les scripts ont été vérifiés par analyse statique (chapitre 15). Les premiers essais sous MATLAB R2025b ont validé la création des données, de la hiérarchie et des transitions ; le modèle construit à partir de zéro </w:t>
+            </w:r>
+            <w:r>
+              <w:rPr>
+                <w:b/>
+                <w:bCs/>
+              </w:rPr>
+              <w:t xml:space="preserve">compile sans erreur</w:t>
+            </w:r>
+            <w:r>
+              <w:t xml:space="preserve"> ; la simulation des scénarios est à confirmer.</w:t>
             </w:r>
           </w:p>
         </w:tc>
@@ -33420,7 +33430,7 @@
       <w:r>
         <w:t xml:space="preserve"> </w:t>
       </w:r>
-      <w:hyperlink w:history="1" r:id="rId6rnhr5p0ocosl7ra1hgby">
+      <w:hyperlink w:history="1" r:id="rIda6iszchhnutexp_8xgqzu">
         <w:r>
           <w:rPr>
             <w:rStyle w:val="Hyperlink"/>
@@ -33460,7 +33470,7 @@
       <w:r>
         <w:t xml:space="preserve"> </w:t>
       </w:r>
-      <w:hyperlink w:history="1" r:id="rIdhx_12kbexpnlacjrrpu26">
+      <w:hyperlink w:history="1" r:id="rId1iqjbprv-m2hn7g-0fe4f">
         <w:r>
           <w:rPr>
             <w:rStyle w:val="Hyperlink"/>
@@ -33500,7 +33510,7 @@
       <w:r>
         <w:t xml:space="preserve"> </w:t>
       </w:r>
-      <w:hyperlink w:history="1" r:id="rIdlo3cqrz9gzrrfr2pn6fnr">
+      <w:hyperlink w:history="1" r:id="rIdowgzxvtcuxbvfnidbpwjo">
         <w:r>
           <w:rPr>
             <w:rStyle w:val="Hyperlink"/>
@@ -33540,7 +33550,7 @@
       <w:r>
         <w:t xml:space="preserve"> </w:t>
       </w:r>
-      <w:hyperlink w:history="1" r:id="rId9fnuujnzbyvnh67b5dhtc">
+      <w:hyperlink w:history="1" r:id="rIdj0skfspshqrnshtvaixdb">
         <w:r>
           <w:rPr>
             <w:rStyle w:val="Hyperlink"/>
@@ -33580,7 +33590,7 @@
       <w:r>
         <w:t xml:space="preserve"> </w:t>
       </w:r>
-      <w:hyperlink w:history="1" r:id="rId3hx0vwxmb83xqp0r6-pnr">
+      <w:hyperlink w:history="1" r:id="rIdvkchbafl9fsqri1srlu9b">
         <w:r>
           <w:rPr>
             <w:rStyle w:val="Hyperlink"/>
@@ -33620,7 +33630,7 @@
       <w:r>
         <w:t xml:space="preserve"> </w:t>
       </w:r>
-      <w:hyperlink w:history="1" r:id="rIdwrbdfeqr_cijeexblplu2">
+      <w:hyperlink w:history="1" r:id="rId0egfk6-otta1aden0mtxr">
         <w:r>
           <w:rPr>
             <w:rStyle w:val="Hyperlink"/>
@@ -33660,7 +33670,7 @@
       <w:r>
         <w:t xml:space="preserve"> </w:t>
       </w:r>
-      <w:hyperlink w:history="1" r:id="rIdc-lt2xd_dk313jvq1qs8a">
+      <w:hyperlink w:history="1" r:id="rIdpuvce1x2g6lzm2bcatmkj">
         <w:r>
           <w:rPr>
             <w:rStyle w:val="Hyperlink"/>
@@ -33700,7 +33710,7 @@
       <w:r>
         <w:t xml:space="preserve"> </w:t>
       </w:r>
-      <w:hyperlink w:history="1" r:id="rIdxrwmlovn10lumqxfm6rpu">
+      <w:hyperlink w:history="1" r:id="rIdapkqq4p3nvtrfydjwwc-1">
         <w:r>
           <w:rPr>
             <w:rStyle w:val="Hyperlink"/>
@@ -33740,7 +33750,7 @@
       <w:r>
         <w:t xml:space="preserve"> </w:t>
       </w:r>
-      <w:hyperlink w:history="1" r:id="rIdckjhdgf8uz4io_mkpj6xe">
+      <w:hyperlink w:history="1" r:id="rIdnwkim4kvol_wvfuf5ghjz">
         <w:r>
           <w:rPr>
             <w:rStyle w:val="Hyperlink"/>
@@ -33790,7 +33800,7 @@
       <w:r>
         <w:t xml:space="preserve"> </w:t>
       </w:r>
-      <w:hyperlink w:history="1" r:id="rIdh9adbvkspseit99ymkvv8">
+      <w:hyperlink w:history="1" r:id="rId6dqvpuqjdyn-uodn7nimh">
         <w:r>
           <w:rPr>
             <w:rStyle w:val="Hyperlink"/>
@@ -33830,7 +33840,7 @@
       <w:r>
         <w:t xml:space="preserve"> </w:t>
       </w:r>
-      <w:hyperlink w:history="1" r:id="rIdq3uryqqbf7hfvrdrxks7n">
+      <w:hyperlink w:history="1" r:id="rIdr3cxd_q4xtxlnd4geydn5">
         <w:r>
           <w:rPr>
             <w:rStyle w:val="Hyperlink"/>
@@ -33870,7 +33880,7 @@
       <w:r>
         <w:t xml:space="preserve"> </w:t>
       </w:r>
-      <w:hyperlink w:history="1" r:id="rIdbs-nar0is6u1ntm_ejwqi">
+      <w:hyperlink w:history="1" r:id="rId1a-4pmkxwgd_k3qeyin-r">
         <w:r>
           <w:rPr>
             <w:rStyle w:val="Hyperlink"/>
@@ -33900,7 +33910,7 @@
       <w:r>
         <w:t xml:space="preserve"> </w:t>
       </w:r>
-      <w:hyperlink w:history="1" r:id="rIdrmnyl5odgounzxzjbw1wp">
+      <w:hyperlink w:history="1" r:id="rId2_onx9dl5anohonoumxvt">
         <w:r>
           <w:rPr>
             <w:rStyle w:val="Hyperlink"/>
@@ -33994,7 +34004,7 @@
       <w:r>
         <w:t xml:space="preserve"> </w:t>
       </w:r>
-      <w:hyperlink w:history="1" r:id="rIdirycn7avpf4zj7legsddy">
+      <w:hyperlink w:history="1" r:id="rIdskbnjfgwg9-uzsvyloyna">
         <w:r>
           <w:rPr>
             <w:rStyle w:val="Hyperlink"/>
@@ -34034,7 +34044,7 @@
       <w:r>
         <w:t xml:space="preserve"> </w:t>
       </w:r>
-      <w:hyperlink w:history="1" r:id="rIdyc211yw5txa3fqrtgozou">
+      <w:hyperlink w:history="1" r:id="rIdwk9h9y81cg4o_twggxf9a">
         <w:r>
           <w:rPr>
             <w:rStyle w:val="Hyperlink"/>
@@ -34074,7 +34084,7 @@
       <w:r>
         <w:t xml:space="preserve"> </w:t>
       </w:r>
-      <w:hyperlink w:history="1" r:id="rIdbw_9hkhdcmyqk1ejij1ea">
+      <w:hyperlink w:history="1" r:id="rIdndu4x3j2y1vwkl6oehgmj">
         <w:r>
           <w:rPr>
             <w:rStyle w:val="Hyperlink"/>
@@ -34104,7 +34114,7 @@
       <w:r>
         <w:t xml:space="preserve"> </w:t>
       </w:r>
-      <w:hyperlink w:history="1" r:id="rIdaqffffdm_6k8xzhxcjea0">
+      <w:hyperlink w:history="1" r:id="rIdjqoptd8wmo-lxbuolvq01">
         <w:r>
           <w:rPr>
             <w:rStyle w:val="Hyperlink"/>
@@ -34134,7 +34144,7 @@
       <w:r>
         <w:t xml:space="preserve"> </w:t>
       </w:r>
-      <w:hyperlink w:history="1" r:id="rIdbggkrs5wx5ecnnxa2qsj5">
+      <w:hyperlink w:history="1" r:id="rIdyaakqpziax1sif00cssgd">
         <w:r>
           <w:rPr>
             <w:rStyle w:val="Hyperlink"/>
@@ -34164,7 +34174,7 @@
       <w:r>
         <w:t xml:space="preserve"> </w:t>
       </w:r>
-      <w:hyperlink w:history="1" r:id="rId8clis-x_gg5wxwq0xdogp">
+      <w:hyperlink w:history="1" r:id="rId4lawvmlxaxsanus3nzr4l">
         <w:r>
           <w:rPr>
             <w:rStyle w:val="Hyperlink"/>
@@ -34194,7 +34204,7 @@
       <w:r>
         <w:t xml:space="preserve"> </w:t>
       </w:r>
-      <w:hyperlink w:history="1" r:id="rIdd_9svgl2xuyagwzfpiuqo">
+      <w:hyperlink w:history="1" r:id="rIdrs-e0xwupxbtc8aejkoqf">
         <w:r>
           <w:rPr>
             <w:rStyle w:val="Hyperlink"/>
@@ -34234,7 +34244,7 @@
       <w:r>
         <w:t xml:space="preserve"> </w:t>
       </w:r>
-      <w:hyperlink w:history="1" r:id="rIdh-ajpk1ar72jkn5x4mp81">
+      <w:hyperlink w:history="1" r:id="rIdxzzkizi6uxqrmpoxaud02">
         <w:r>
           <w:rPr>
             <w:rStyle w:val="Hyperlink"/>
@@ -34264,7 +34274,7 @@
       <w:r>
         <w:t xml:space="preserve"> </w:t>
       </w:r>
-      <w:hyperlink w:history="1" r:id="rIdsjqmnexqv22pzb23pppi4">
+      <w:hyperlink w:history="1" r:id="rIdicbsacuuswmp6fg4hl1qv">
         <w:r>
           <w:rPr>
             <w:rStyle w:val="Hyperlink"/>
@@ -34294,7 +34304,7 @@
       <w:r>
         <w:t xml:space="preserve"> </w:t>
       </w:r>
-      <w:hyperlink w:history="1" r:id="rIda-od_abvfs9jtfw55s40j">
+      <w:hyperlink w:history="1" r:id="rId5vbfae5b0ha6ucjtleqmy">
         <w:r>
           <w:rPr>
             <w:rStyle w:val="Hyperlink"/>
@@ -34324,7 +34334,7 @@
       <w:r>
         <w:t xml:space="preserve"> </w:t>
       </w:r>
-      <w:hyperlink w:history="1" r:id="rIdl9163azk9r-oigb1rnfdn">
+      <w:hyperlink w:history="1" r:id="rIdnbnjwiescleoa1cfaql5f">
         <w:r>
           <w:rPr>
             <w:rStyle w:val="Hyperlink"/>
@@ -34354,7 +34364,7 @@
       <w:r>
         <w:t xml:space="preserve"> </w:t>
       </w:r>
-      <w:hyperlink w:history="1" r:id="rIdlgccgwh3qchlt284w85qt">
+      <w:hyperlink w:history="1" r:id="rIdbjvpnqw8c1ebwf1an0axh">
         <w:r>
           <w:rPr>
             <w:rStyle w:val="Hyperlink"/>
@@ -34384,7 +34394,7 @@
       <w:r>
         <w:t xml:space="preserve"> </w:t>
       </w:r>
-      <w:hyperlink w:history="1" r:id="rIdkzs-gvekwel66n0jt6bc4">
+      <w:hyperlink w:history="1" r:id="rIdhcwofwxwbdr_f5acudakw">
         <w:r>
           <w:rPr>
             <w:rStyle w:val="Hyperlink"/>
@@ -34414,7 +34424,7 @@
       <w:r>
         <w:t xml:space="preserve"> </w:t>
       </w:r>
-      <w:hyperlink w:history="1" r:id="rIdmfin2vce5ifnfkjsjdqba">
+      <w:hyperlink w:history="1" r:id="rIdysbtx1wwznh3bdg3nfknl">
         <w:r>
           <w:rPr>
             <w:rStyle w:val="Hyperlink"/>
@@ -34444,7 +34454,7 @@
       <w:r>
         <w:t xml:space="preserve"> </w:t>
       </w:r>
-      <w:hyperlink w:history="1" r:id="rId4kgt3l-2s8xvnjxk9voa5">
+      <w:hyperlink w:history="1" r:id="rId_f7gdqbdfe6tfpkvztfu0">
         <w:r>
           <w:rPr>
             <w:rStyle w:val="Hyperlink"/>
@@ -34474,7 +34484,7 @@
       <w:r>
         <w:t xml:space="preserve"> </w:t>
       </w:r>
-      <w:hyperlink w:history="1" r:id="rIdg1-pyvkxdqpcb5j1r83mf">
+      <w:hyperlink w:history="1" r:id="rIdf5ztlejlne4vtpgrl1vsw">
         <w:r>
           <w:rPr>
             <w:rStyle w:val="Hyperlink"/>
@@ -34514,7 +34524,7 @@
       <w:r>
         <w:t xml:space="preserve"> </w:t>
       </w:r>
-      <w:hyperlink w:history="1" r:id="rIdvbka4z8diglnxbexf9m5i">
+      <w:hyperlink w:history="1" r:id="rIdokr5r12hnnbwyncumf36p">
         <w:r>
           <w:rPr>
             <w:rStyle w:val="Hyperlink"/>
@@ -34544,7 +34554,7 @@
       <w:r>
         <w:t xml:space="preserve"> </w:t>
       </w:r>
-      <w:hyperlink w:history="1" r:id="rIdtg2g0h_l_bq_ye25jdxuz">
+      <w:hyperlink w:history="1" r:id="rIdgqhrl9frig7cuboxtbwag">
         <w:r>
           <w:rPr>
             <w:rStyle w:val="Hyperlink"/>
@@ -34574,7 +34584,7 @@
       <w:r>
         <w:t xml:space="preserve"> </w:t>
       </w:r>
-      <w:hyperlink w:history="1" r:id="rId0s9ma9cfcaurgqyefvvvm">
+      <w:hyperlink w:history="1" r:id="rIdm_uvd2upbvconoxadljl9">
         <w:r>
           <w:rPr>
             <w:rStyle w:val="Hyperlink"/>
@@ -34614,7 +34624,7 @@
       <w:r>
         <w:t xml:space="preserve"> </w:t>
       </w:r>
-      <w:hyperlink w:history="1" r:id="rId0j8ldciivgtwrj2z15ix3">
+      <w:hyperlink w:history="1" r:id="rIdftx5ptkkon9oqlexk7bux">
         <w:r>
           <w:rPr>
             <w:rStyle w:val="Hyperlink"/>

</xml_diff>

<commit_message>
Chart FSM : transitions tracées dans leur parent naturel ; 1er essai Simulink
Sous R2025b, la simulation du scénario 1 reproduit la séquence du firmware
(écarts < 1 s puis ~4 s par cycle de veille, dû à la lecture de sonde à 1 s
côté firmware). Les avertissements 'not fully contained in natural parent'
venaient du tracé par défaut des transitions : tracé droit entre bords qui
se font face, arc sous les boîtes pour les états frères non voisins,
décalage des transitions parallèles ; sous-états de combustion un peu moins
hauts pour laisser la marge. Mémoire §15.3 : résultat du premier essai.

Co-Authored-By: Claude Opus 5.5 <noreply@anthropic.com>
Claude-Session: https://claude.ai/code/session_011f3VP4wcPxf7KecGedoGY8
</commit_message>
<xml_diff>
--- a/docs/memoire/Commande_Sechoir_Solaire_Hybride.docx
+++ b/docs/memoire/Commande_Sechoir_Solaire_Hybride.docx
@@ -31550,6 +31550,22 @@
     </w:p>
     <w:p>
       <w:pPr>
+        <w:spacing w:after="120" w:line="276"/>
+        <w:jc w:val="both"/>
+      </w:pPr>
+      <w:r>
+        <w:rPr>
+          <w:b/>
+          <w:bCs/>
+        </w:rPr>
+        <w:t xml:space="preserve">Premier essai Simulink (MATLAB R2025b, scénario 1)</w:t>
+      </w:r>
+      <w:r>
+        <w:t xml:space="preserve"> : le modèle Stateflow reproduit la même séquence que le firmware (MODE_H2 à 10 s, allumage à 100 % à 130 s, 67 % à 222 s, 33 % à 335 s, veille à 597 s, rallumage à 33 % à 1189 s…), avec des écarts inférieurs à 1 s pendant les vingt premières minutes. Un écart d'environ 4 s s'accumule ensuite à chaque cycle de veille (14 s après une heure) : le firmware lit la sonde T_sec une fois par seconde avec une conversion asynchrone du DS18B20, alors que Simulink la lit tous les 0,1 s. Ce retard de mesure fait légèrement dépasser le seuil de coupure, et la veille dure un peu plus longtemps. La séquence des états reste identique.</w:t>
+      </w:r>
+    </w:p>
+    <w:p>
+      <w:pPr>
         <w:pStyle w:val="Heading2"/>
       </w:pPr>
       <w:r>
@@ -33430,7 +33446,7 @@
       <w:r>
         <w:t xml:space="preserve"> </w:t>
       </w:r>
-      <w:hyperlink w:history="1" r:id="rIda6iszchhnutexp_8xgqzu">
+      <w:hyperlink w:history="1" r:id="rIdzsuw7pedhgdnxsmrcrk0_">
         <w:r>
           <w:rPr>
             <w:rStyle w:val="Hyperlink"/>
@@ -33470,7 +33486,7 @@
       <w:r>
         <w:t xml:space="preserve"> </w:t>
       </w:r>
-      <w:hyperlink w:history="1" r:id="rId1iqjbprv-m2hn7g-0fe4f">
+      <w:hyperlink w:history="1" r:id="rIdkcmsih2_tf1iauj__hcov">
         <w:r>
           <w:rPr>
             <w:rStyle w:val="Hyperlink"/>
@@ -33510,7 +33526,7 @@
       <w:r>
         <w:t xml:space="preserve"> </w:t>
       </w:r>
-      <w:hyperlink w:history="1" r:id="rIdowgzxvtcuxbvfnidbpwjo">
+      <w:hyperlink w:history="1" r:id="rId1tcf_tzcrqn6ltq2jskj4">
         <w:r>
           <w:rPr>
             <w:rStyle w:val="Hyperlink"/>
@@ -33550,7 +33566,7 @@
       <w:r>
         <w:t xml:space="preserve"> </w:t>
       </w:r>
-      <w:hyperlink w:history="1" r:id="rIdj0skfspshqrnshtvaixdb">
+      <w:hyperlink w:history="1" r:id="rIdv3mrjirc-jdovyozqlcmw">
         <w:r>
           <w:rPr>
             <w:rStyle w:val="Hyperlink"/>
@@ -33590,7 +33606,7 @@
       <w:r>
         <w:t xml:space="preserve"> </w:t>
       </w:r>
-      <w:hyperlink w:history="1" r:id="rIdvkchbafl9fsqri1srlu9b">
+      <w:hyperlink w:history="1" r:id="rIdtfyvtwwumfveu092-nizp">
         <w:r>
           <w:rPr>
             <w:rStyle w:val="Hyperlink"/>
@@ -33630,7 +33646,7 @@
       <w:r>
         <w:t xml:space="preserve"> </w:t>
       </w:r>
-      <w:hyperlink w:history="1" r:id="rId0egfk6-otta1aden0mtxr">
+      <w:hyperlink w:history="1" r:id="rIdqwp2h5hkwcz7etjveitke">
         <w:r>
           <w:rPr>
             <w:rStyle w:val="Hyperlink"/>
@@ -33670,7 +33686,7 @@
       <w:r>
         <w:t xml:space="preserve"> </w:t>
       </w:r>
-      <w:hyperlink w:history="1" r:id="rIdpuvce1x2g6lzm2bcatmkj">
+      <w:hyperlink w:history="1" r:id="rIdxdd5786z2ngmz46orgz6n">
         <w:r>
           <w:rPr>
             <w:rStyle w:val="Hyperlink"/>
@@ -33710,7 +33726,7 @@
       <w:r>
         <w:t xml:space="preserve"> </w:t>
       </w:r>
-      <w:hyperlink w:history="1" r:id="rIdapkqq4p3nvtrfydjwwc-1">
+      <w:hyperlink w:history="1" r:id="rIdbr8iopzm6hzkuw0k85zjg">
         <w:r>
           <w:rPr>
             <w:rStyle w:val="Hyperlink"/>
@@ -33750,7 +33766,7 @@
       <w:r>
         <w:t xml:space="preserve"> </w:t>
       </w:r>
-      <w:hyperlink w:history="1" r:id="rIdnwkim4kvol_wvfuf5ghjz">
+      <w:hyperlink w:history="1" r:id="rId4v580w5hmdqpjc6jzzqrh">
         <w:r>
           <w:rPr>
             <w:rStyle w:val="Hyperlink"/>
@@ -33800,7 +33816,7 @@
       <w:r>
         <w:t xml:space="preserve"> </w:t>
       </w:r>
-      <w:hyperlink w:history="1" r:id="rId6dqvpuqjdyn-uodn7nimh">
+      <w:hyperlink w:history="1" r:id="rIdned9pejm8gaksmxq39tod">
         <w:r>
           <w:rPr>
             <w:rStyle w:val="Hyperlink"/>
@@ -33840,7 +33856,7 @@
       <w:r>
         <w:t xml:space="preserve"> </w:t>
       </w:r>
-      <w:hyperlink w:history="1" r:id="rIdr3cxd_q4xtxlnd4geydn5">
+      <w:hyperlink w:history="1" r:id="rId-r2fmmwwluvo_2lzp2y2_">
         <w:r>
           <w:rPr>
             <w:rStyle w:val="Hyperlink"/>
@@ -33880,7 +33896,7 @@
       <w:r>
         <w:t xml:space="preserve"> </w:t>
       </w:r>
-      <w:hyperlink w:history="1" r:id="rId1a-4pmkxwgd_k3qeyin-r">
+      <w:hyperlink w:history="1" r:id="rIduj0eajjk9jkvo8dp-f6na">
         <w:r>
           <w:rPr>
             <w:rStyle w:val="Hyperlink"/>
@@ -33910,7 +33926,7 @@
       <w:r>
         <w:t xml:space="preserve"> </w:t>
       </w:r>
-      <w:hyperlink w:history="1" r:id="rId2_onx9dl5anohonoumxvt">
+      <w:hyperlink w:history="1" r:id="rIdgfhs6sgxzt040taw8e1dj">
         <w:r>
           <w:rPr>
             <w:rStyle w:val="Hyperlink"/>
@@ -34004,7 +34020,7 @@
       <w:r>
         <w:t xml:space="preserve"> </w:t>
       </w:r>
-      <w:hyperlink w:history="1" r:id="rIdskbnjfgwg9-uzsvyloyna">
+      <w:hyperlink w:history="1" r:id="rIdf_gsrpatfu2qctnqpbjoc">
         <w:r>
           <w:rPr>
             <w:rStyle w:val="Hyperlink"/>
@@ -34044,7 +34060,7 @@
       <w:r>
         <w:t xml:space="preserve"> </w:t>
       </w:r>
-      <w:hyperlink w:history="1" r:id="rIdwk9h9y81cg4o_twggxf9a">
+      <w:hyperlink w:history="1" r:id="rIdi3b5bnv3dfpqppkio1hpc">
         <w:r>
           <w:rPr>
             <w:rStyle w:val="Hyperlink"/>
@@ -34084,7 +34100,7 @@
       <w:r>
         <w:t xml:space="preserve"> </w:t>
       </w:r>
-      <w:hyperlink w:history="1" r:id="rIdndu4x3j2y1vwkl6oehgmj">
+      <w:hyperlink w:history="1" r:id="rIddwhdld1o2jym-i-fd1tfc">
         <w:r>
           <w:rPr>
             <w:rStyle w:val="Hyperlink"/>
@@ -34114,7 +34130,7 @@
       <w:r>
         <w:t xml:space="preserve"> </w:t>
       </w:r>
-      <w:hyperlink w:history="1" r:id="rIdjqoptd8wmo-lxbuolvq01">
+      <w:hyperlink w:history="1" r:id="rIdgsdylkekhwc4qekria8oh">
         <w:r>
           <w:rPr>
             <w:rStyle w:val="Hyperlink"/>
@@ -34144,7 +34160,7 @@
       <w:r>
         <w:t xml:space="preserve"> </w:t>
       </w:r>
-      <w:hyperlink w:history="1" r:id="rIdyaakqpziax1sif00cssgd">
+      <w:hyperlink w:history="1" r:id="rIdtxaf27d-jtynidwj2pp3q">
         <w:r>
           <w:rPr>
             <w:rStyle w:val="Hyperlink"/>
@@ -34174,7 +34190,7 @@
       <w:r>
         <w:t xml:space="preserve"> </w:t>
       </w:r>
-      <w:hyperlink w:history="1" r:id="rId4lawvmlxaxsanus3nzr4l">
+      <w:hyperlink w:history="1" r:id="rId9pyxut036zcn51zhbo5dk">
         <w:r>
           <w:rPr>
             <w:rStyle w:val="Hyperlink"/>
@@ -34204,7 +34220,7 @@
       <w:r>
         <w:t xml:space="preserve"> </w:t>
       </w:r>
-      <w:hyperlink w:history="1" r:id="rIdrs-e0xwupxbtc8aejkoqf">
+      <w:hyperlink w:history="1" r:id="rIdiry_fvruq1t9nxz10oszy">
         <w:r>
           <w:rPr>
             <w:rStyle w:val="Hyperlink"/>
@@ -34244,7 +34260,7 @@
       <w:r>
         <w:t xml:space="preserve"> </w:t>
       </w:r>
-      <w:hyperlink w:history="1" r:id="rIdxzzkizi6uxqrmpoxaud02">
+      <w:hyperlink w:history="1" r:id="rIdoqu6dkhorkiutguztcv5h">
         <w:r>
           <w:rPr>
             <w:rStyle w:val="Hyperlink"/>
@@ -34274,7 +34290,7 @@
       <w:r>
         <w:t xml:space="preserve"> </w:t>
       </w:r>
-      <w:hyperlink w:history="1" r:id="rIdicbsacuuswmp6fg4hl1qv">
+      <w:hyperlink w:history="1" r:id="rIdwgyblctefrklmr0xybxzr">
         <w:r>
           <w:rPr>
             <w:rStyle w:val="Hyperlink"/>
@@ -34304,7 +34320,7 @@
       <w:r>
         <w:t xml:space="preserve"> </w:t>
       </w:r>
-      <w:hyperlink w:history="1" r:id="rId5vbfae5b0ha6ucjtleqmy">
+      <w:hyperlink w:history="1" r:id="rIdavfrq3rrkdxebdlsvh75x">
         <w:r>
           <w:rPr>
             <w:rStyle w:val="Hyperlink"/>
@@ -34334,7 +34350,7 @@
       <w:r>
         <w:t xml:space="preserve"> </w:t>
       </w:r>
-      <w:hyperlink w:history="1" r:id="rIdnbnjwiescleoa1cfaql5f">
+      <w:hyperlink w:history="1" r:id="rIdcgxzyskgny_e2q5j4fxxn">
         <w:r>
           <w:rPr>
             <w:rStyle w:val="Hyperlink"/>
@@ -34364,7 +34380,7 @@
       <w:r>
         <w:t xml:space="preserve"> </w:t>
       </w:r>
-      <w:hyperlink w:history="1" r:id="rIdbjvpnqw8c1ebwf1an0axh">
+      <w:hyperlink w:history="1" r:id="rIdhizkmlfogvjbkjl83wlk5">
         <w:r>
           <w:rPr>
             <w:rStyle w:val="Hyperlink"/>
@@ -34394,7 +34410,7 @@
       <w:r>
         <w:t xml:space="preserve"> </w:t>
       </w:r>
-      <w:hyperlink w:history="1" r:id="rIdhcwofwxwbdr_f5acudakw">
+      <w:hyperlink w:history="1" r:id="rIdrsl0wqbajk_eui3i9iagj">
         <w:r>
           <w:rPr>
             <w:rStyle w:val="Hyperlink"/>
@@ -34424,7 +34440,7 @@
       <w:r>
         <w:t xml:space="preserve"> </w:t>
       </w:r>
-      <w:hyperlink w:history="1" r:id="rIdysbtx1wwznh3bdg3nfknl">
+      <w:hyperlink w:history="1" r:id="rIdn7eybsepuyp5p43sxlzzi">
         <w:r>
           <w:rPr>
             <w:rStyle w:val="Hyperlink"/>
@@ -34454,7 +34470,7 @@
       <w:r>
         <w:t xml:space="preserve"> </w:t>
       </w:r>
-      <w:hyperlink w:history="1" r:id="rId_f7gdqbdfe6tfpkvztfu0">
+      <w:hyperlink w:history="1" r:id="rIdp5eij-pihgssuqdhca-ak">
         <w:r>
           <w:rPr>
             <w:rStyle w:val="Hyperlink"/>
@@ -34484,7 +34500,7 @@
       <w:r>
         <w:t xml:space="preserve"> </w:t>
       </w:r>
-      <w:hyperlink w:history="1" r:id="rIdf5ztlejlne4vtpgrl1vsw">
+      <w:hyperlink w:history="1" r:id="rIdp3fdc9eirweore30y1xuf">
         <w:r>
           <w:rPr>
             <w:rStyle w:val="Hyperlink"/>
@@ -34524,7 +34540,7 @@
       <w:r>
         <w:t xml:space="preserve"> </w:t>
       </w:r>
-      <w:hyperlink w:history="1" r:id="rIdokr5r12hnnbwyncumf36p">
+      <w:hyperlink w:history="1" r:id="rIdn2lyska6k3sptyslngjmi">
         <w:r>
           <w:rPr>
             <w:rStyle w:val="Hyperlink"/>
@@ -34554,7 +34570,7 @@
       <w:r>
         <w:t xml:space="preserve"> </w:t>
       </w:r>
-      <w:hyperlink w:history="1" r:id="rIdgqhrl9frig7cuboxtbwag">
+      <w:hyperlink w:history="1" r:id="rId-ae2-510itupqe1tu5nqx">
         <w:r>
           <w:rPr>
             <w:rStyle w:val="Hyperlink"/>
@@ -34584,7 +34600,7 @@
       <w:r>
         <w:t xml:space="preserve"> </w:t>
       </w:r>
-      <w:hyperlink w:history="1" r:id="rIdm_uvd2upbvconoxadljl9">
+      <w:hyperlink w:history="1" r:id="rIdvlxawydm2wo6pnjupjgyg">
         <w:r>
           <w:rPr>
             <w:rStyle w:val="Hyperlink"/>
@@ -34624,7 +34640,7 @@
       <w:r>
         <w:t xml:space="preserve"> </w:t>
       </w:r>
-      <w:hyperlink w:history="1" r:id="rIdftx5ptkkon9oqlexk7bux">
+      <w:hyperlink w:history="1" r:id="rIdq_feo6kmtpisptylgbslg">
         <w:r>
           <w:rPr>
             <w:rStyle w:val="Hyperlink"/>

</xml_diff>

<commit_message>
Mémoire et doc : validation des 12 scénarios Simulink / firmware
Co-Authored-By: Claude Opus 5.5 <noreply@anthropic.com>
Claude-Session: https://claude.ai/code/session_011f3VP4wcPxf7KecGedoGY8
</commit_message>
<xml_diff>
--- a/docs/memoire/Commande_Sechoir_Solaire_Hybride.docx
+++ b/docs/memoire/Commande_Sechoir_Solaire_Hybride.docx
@@ -29820,17 +29820,17 @@
               <w:jc w:val="both"/>
             </w:pPr>
             <w:r>
-              <w:t xml:space="preserve">Les scripts ont été vérifiés par analyse statique (chapitre 15). Les premiers essais sous MATLAB R2025b ont validé la création des données, de la hiérarchie et des transitions ; le modèle construit à partir de zéro </w:t>
+              <w:t xml:space="preserve">Les scripts ont été vérifiés par analyse statique (chapitre 15). Les premiers essais sous MATLAB R2025b ont validé la création des données, de la hiérarchie et des transitions ; le modèle construit à partir de zéro compile et </w:t>
             </w:r>
             <w:r>
               <w:rPr>
                 <w:b/>
                 <w:bCs/>
               </w:rPr>
-              <w:t xml:space="preserve">compile sans erreur</w:t>
-            </w:r>
-            <w:r>
-              <w:t xml:space="preserve"> ; la simulation des scénarios est à confirmer.</w:t>
+              <w:t xml:space="preserve">les douze scénarios sont validés contre le firmware</w:t>
+            </w:r>
+            <w:r>
+              <w:t xml:space="preserve"> (§15.3).</w:t>
             </w:r>
           </w:p>
         </w:tc>
@@ -31558,10 +31558,1666 @@
           <w:b/>
           <w:bCs/>
         </w:rPr>
-        <w:t xml:space="preserve">Premier essai Simulink (MATLAB R2025b, scénario 1)</w:t>
-      </w:r>
-      <w:r>
-        <w:t xml:space="preserve"> : le modèle Stateflow reproduit la même séquence que le firmware (MODE_H2 à 10 s, allumage à 100 % à 130 s, 67 % à 222 s, 33 % à 335 s, veille à 597 s, rallumage à 33 % à 1189 s…), avec des écarts inférieurs à 1 s pendant les vingt premières minutes. Un écart d'environ 4 s s'accumule ensuite à chaque cycle de veille (14 s après une heure) : le firmware lit la sonde T_sec une fois par seconde avec une conversion asynchrone du DS18B20, alors que Simulink la lit tous les 0,1 s. Ce retard de mesure fait légèrement dépasser le seuil de coupure, et la veille dure un peu plus longtemps. La séquence des états reste identique.</w:t>
+        <w:t xml:space="preserve">Validation croisée sous MATLAB R2025b</w:t>
+      </w:r>
+      <w:r>
+        <w:t xml:space="preserve"> : les douze scénarios ont été simulés avec le modèle Stateflow puis comparés à la référence du firmware (</w:t>
+      </w:r>
+      <w:r>
+        <w:rPr>
+          <w:rFonts w:ascii="Consolas" w:cs="Consolas" w:eastAsia="Consolas" w:hAnsi="Consolas"/>
+          <w:color w:val="1F3864"/>
+          <w:sz w:val="20"/>
+          <w:szCs w:val="20"/>
+        </w:rPr>
+        <w:t xml:space="preserve">comparer_scenario</w:t>
+      </w:r>
+      <w:r>
+        <w:t xml:space="preserve">). Tous les changements d'état arrivent dans le même ordre et aux mêmes instants :</w:t>
+      </w:r>
+    </w:p>
+    <w:tbl>
+      <w:tblPr>
+        <w:tblW w:type="dxa" w:w="9070"/>
+        <w:tblBorders>
+          <w:top w:val="single" w:color="auto" w:sz="4"/>
+          <w:left w:val="single" w:color="auto" w:sz="4"/>
+          <w:bottom w:val="single" w:color="auto" w:sz="4"/>
+          <w:right w:val="single" w:color="auto" w:sz="4"/>
+          <w:insideH w:val="single" w:color="auto" w:sz="4"/>
+          <w:insideV w:val="single" w:color="auto" w:sz="4"/>
+        </w:tblBorders>
+      </w:tblPr>
+      <w:tblGrid>
+        <w:gridCol w:w="579"/>
+        <w:gridCol w:w="2509"/>
+        <w:gridCol w:w="4824"/>
+        <w:gridCol w:w="1158"/>
+      </w:tblGrid>
+      <w:tr>
+        <w:trPr>
+          <w:cantSplit/>
+          <w:tblHeader/>
+        </w:trPr>
+        <w:tc>
+          <w:tcPr>
+            <w:tcW w:type="dxa" w:w="579"/>
+            <w:tcBorders>
+              <w:top w:val="single" w:color="BFC7D5" w:sz="4"/>
+              <w:left w:val="single" w:color="BFC7D5" w:sz="4"/>
+              <w:bottom w:val="single" w:color="BFC7D5" w:sz="4"/>
+              <w:right w:val="single" w:color="BFC7D5" w:sz="4"/>
+            </w:tcBorders>
+            <w:shd w:fill="1F3864" w:color="auto" w:val="clear"/>
+            <w:tcMar>
+              <w:top w:type="dxa" w:w="50"/>
+              <w:left w:type="dxa" w:w="90"/>
+              <w:bottom w:type="dxa" w:w="50"/>
+              <w:right w:type="dxa" w:w="90"/>
+            </w:tcMar>
+          </w:tcPr>
+          <w:p>
+            <w:pPr>
+              <w:spacing w:after="20"/>
+            </w:pPr>
+            <w:r>
+              <w:rPr>
+                <w:b/>
+                <w:bCs/>
+                <w:color w:val="FFFFFF"/>
+                <w:sz w:val="19"/>
+                <w:szCs w:val="19"/>
+              </w:rPr>
+              <w:t xml:space="preserve">N°</w:t>
+            </w:r>
+          </w:p>
+        </w:tc>
+        <w:tc>
+          <w:tcPr>
+            <w:tcW w:type="dxa" w:w="2509"/>
+            <w:tcBorders>
+              <w:top w:val="single" w:color="BFC7D5" w:sz="4"/>
+              <w:left w:val="single" w:color="BFC7D5" w:sz="4"/>
+              <w:bottom w:val="single" w:color="BFC7D5" w:sz="4"/>
+              <w:right w:val="single" w:color="BFC7D5" w:sz="4"/>
+            </w:tcBorders>
+            <w:shd w:fill="1F3864" w:color="auto" w:val="clear"/>
+            <w:tcMar>
+              <w:top w:type="dxa" w:w="50"/>
+              <w:left w:type="dxa" w:w="90"/>
+              <w:bottom w:type="dxa" w:w="50"/>
+              <w:right w:type="dxa" w:w="90"/>
+            </w:tcMar>
+          </w:tcPr>
+          <w:p>
+            <w:pPr>
+              <w:spacing w:after="20"/>
+            </w:pPr>
+            <w:r>
+              <w:rPr>
+                <w:b/>
+                <w:bCs/>
+                <w:color w:val="FFFFFF"/>
+                <w:sz w:val="19"/>
+                <w:szCs w:val="19"/>
+              </w:rPr>
+              <w:t xml:space="preserve">Scénario</w:t>
+            </w:r>
+          </w:p>
+        </w:tc>
+        <w:tc>
+          <w:tcPr>
+            <w:tcW w:type="dxa" w:w="4824"/>
+            <w:tcBorders>
+              <w:top w:val="single" w:color="BFC7D5" w:sz="4"/>
+              <w:left w:val="single" w:color="BFC7D5" w:sz="4"/>
+              <w:bottom w:val="single" w:color="BFC7D5" w:sz="4"/>
+              <w:right w:val="single" w:color="BFC7D5" w:sz="4"/>
+            </w:tcBorders>
+            <w:shd w:fill="1F3864" w:color="auto" w:val="clear"/>
+            <w:tcMar>
+              <w:top w:type="dxa" w:w="50"/>
+              <w:left w:type="dxa" w:w="90"/>
+              <w:bottom w:type="dxa" w:w="50"/>
+              <w:right w:type="dxa" w:w="90"/>
+            </w:tcMar>
+          </w:tcPr>
+          <w:p>
+            <w:pPr>
+              <w:spacing w:after="20"/>
+            </w:pPr>
+            <w:r>
+              <w:rPr>
+                <w:b/>
+                <w:bCs/>
+                <w:color w:val="FFFFFF"/>
+                <w:sz w:val="19"/>
+                <w:szCs w:val="19"/>
+              </w:rPr>
+              <w:t xml:space="preserve">Changements d'état (Simulink)</w:t>
+            </w:r>
+          </w:p>
+        </w:tc>
+        <w:tc>
+          <w:tcPr>
+            <w:tcW w:type="dxa" w:w="1158"/>
+            <w:tcBorders>
+              <w:top w:val="single" w:color="BFC7D5" w:sz="4"/>
+              <w:left w:val="single" w:color="BFC7D5" w:sz="4"/>
+              <w:bottom w:val="single" w:color="BFC7D5" w:sz="4"/>
+              <w:right w:val="single" w:color="BFC7D5" w:sz="4"/>
+            </w:tcBorders>
+            <w:shd w:fill="1F3864" w:color="auto" w:val="clear"/>
+            <w:tcMar>
+              <w:top w:type="dxa" w:w="50"/>
+              <w:left w:type="dxa" w:w="90"/>
+              <w:bottom w:type="dxa" w:w="50"/>
+              <w:right w:type="dxa" w:w="90"/>
+            </w:tcMar>
+          </w:tcPr>
+          <w:p>
+            <w:pPr>
+              <w:spacing w:after="20"/>
+            </w:pPr>
+            <w:r>
+              <w:rPr>
+                <w:b/>
+                <w:bCs/>
+                <w:color w:val="FFFFFF"/>
+                <w:sz w:val="19"/>
+                <w:szCs w:val="19"/>
+              </w:rPr>
+              <w:t xml:space="preserve">Écart max</w:t>
+            </w:r>
+          </w:p>
+        </w:tc>
+      </w:tr>
+      <w:tr>
+        <w:trPr>
+          <w:cantSplit/>
+        </w:trPr>
+        <w:tc>
+          <w:tcPr>
+            <w:tcW w:type="dxa" w:w="579"/>
+            <w:tcBorders>
+              <w:top w:val="single" w:color="BFC7D5" w:sz="4"/>
+              <w:left w:val="single" w:color="BFC7D5" w:sz="4"/>
+              <w:bottom w:val="single" w:color="BFC7D5" w:sz="4"/>
+              <w:right w:val="single" w:color="BFC7D5" w:sz="4"/>
+            </w:tcBorders>
+            <w:tcMar>
+              <w:top w:type="dxa" w:w="50"/>
+              <w:left w:type="dxa" w:w="90"/>
+              <w:bottom w:type="dxa" w:w="50"/>
+              <w:right w:type="dxa" w:w="90"/>
+            </w:tcMar>
+          </w:tcPr>
+          <w:p>
+            <w:pPr>
+              <w:spacing w:after="20"/>
+            </w:pPr>
+            <w:r>
+              <w:rPr>
+                <w:sz w:val="19"/>
+                <w:szCs w:val="19"/>
+              </w:rPr>
+              <w:t xml:space="preserve">1</w:t>
+            </w:r>
+          </w:p>
+        </w:tc>
+        <w:tc>
+          <w:tcPr>
+            <w:tcW w:type="dxa" w:w="2509"/>
+            <w:tcBorders>
+              <w:top w:val="single" w:color="BFC7D5" w:sz="4"/>
+              <w:left w:val="single" w:color="BFC7D5" w:sz="4"/>
+              <w:bottom w:val="single" w:color="BFC7D5" w:sz="4"/>
+              <w:right w:val="single" w:color="BFC7D5" w:sz="4"/>
+            </w:tcBorders>
+            <w:tcMar>
+              <w:top w:type="dxa" w:w="50"/>
+              <w:left w:type="dxa" w:w="90"/>
+              <w:bottom w:type="dxa" w:w="50"/>
+              <w:right w:type="dxa" w:w="90"/>
+            </w:tcMar>
+          </w:tcPr>
+          <w:p>
+            <w:pPr>
+              <w:spacing w:after="20"/>
+            </w:pPr>
+            <w:r>
+              <w:rPr>
+                <w:sz w:val="19"/>
+                <w:szCs w:val="19"/>
+              </w:rPr>
+              <w:t xml:space="preserve">Démarrage à froid H2</w:t>
+            </w:r>
+          </w:p>
+        </w:tc>
+        <w:tc>
+          <w:tcPr>
+            <w:tcW w:type="dxa" w:w="4824"/>
+            <w:tcBorders>
+              <w:top w:val="single" w:color="BFC7D5" w:sz="4"/>
+              <w:left w:val="single" w:color="BFC7D5" w:sz="4"/>
+              <w:bottom w:val="single" w:color="BFC7D5" w:sz="4"/>
+              <w:right w:val="single" w:color="BFC7D5" w:sz="4"/>
+            </w:tcBorders>
+            <w:tcMar>
+              <w:top w:type="dxa" w:w="50"/>
+              <w:left w:type="dxa" w:w="90"/>
+              <w:bottom w:type="dxa" w:w="50"/>
+              <w:right w:type="dxa" w:w="90"/>
+            </w:tcMar>
+          </w:tcPr>
+          <w:p>
+            <w:pPr>
+              <w:spacing w:after="20"/>
+            </w:pPr>
+            <w:r>
+              <w:rPr>
+                <w:sz w:val="19"/>
+                <w:szCs w:val="19"/>
+              </w:rPr>
+              <w:t xml:space="preserve">H2 10,1 s</w:t>
+            </w:r>
+          </w:p>
+        </w:tc>
+        <w:tc>
+          <w:tcPr>
+            <w:tcW w:type="dxa" w:w="1158"/>
+            <w:tcBorders>
+              <w:top w:val="single" w:color="BFC7D5" w:sz="4"/>
+              <w:left w:val="single" w:color="BFC7D5" w:sz="4"/>
+              <w:bottom w:val="single" w:color="BFC7D5" w:sz="4"/>
+              <w:right w:val="single" w:color="BFC7D5" w:sz="4"/>
+            </w:tcBorders>
+            <w:tcMar>
+              <w:top w:type="dxa" w:w="50"/>
+              <w:left w:type="dxa" w:w="90"/>
+              <w:bottom w:type="dxa" w:w="50"/>
+              <w:right w:type="dxa" w:w="90"/>
+            </w:tcMar>
+          </w:tcPr>
+          <w:p>
+            <w:pPr>
+              <w:spacing w:after="20"/>
+            </w:pPr>
+            <w:r>
+              <w:rPr>
+                <w:sz w:val="19"/>
+                <w:szCs w:val="19"/>
+              </w:rPr>
+              <w:t xml:space="preserve">0,1 s</w:t>
+            </w:r>
+          </w:p>
+        </w:tc>
+      </w:tr>
+      <w:tr>
+        <w:trPr>
+          <w:cantSplit/>
+        </w:trPr>
+        <w:tc>
+          <w:tcPr>
+            <w:tcW w:type="dxa" w:w="579"/>
+            <w:tcBorders>
+              <w:top w:val="single" w:color="BFC7D5" w:sz="4"/>
+              <w:left w:val="single" w:color="BFC7D5" w:sz="4"/>
+              <w:bottom w:val="single" w:color="BFC7D5" w:sz="4"/>
+              <w:right w:val="single" w:color="BFC7D5" w:sz="4"/>
+            </w:tcBorders>
+            <w:tcMar>
+              <w:top w:type="dxa" w:w="50"/>
+              <w:left w:type="dxa" w:w="90"/>
+              <w:bottom w:type="dxa" w:w="50"/>
+              <w:right w:type="dxa" w:w="90"/>
+            </w:tcMar>
+          </w:tcPr>
+          <w:p>
+            <w:pPr>
+              <w:spacing w:after="20"/>
+            </w:pPr>
+            <w:r>
+              <w:rPr>
+                <w:sz w:val="19"/>
+                <w:szCs w:val="19"/>
+              </w:rPr>
+              <w:t xml:space="preserve">2</w:t>
+            </w:r>
+          </w:p>
+        </w:tc>
+        <w:tc>
+          <w:tcPr>
+            <w:tcW w:type="dxa" w:w="2509"/>
+            <w:tcBorders>
+              <w:top w:val="single" w:color="BFC7D5" w:sz="4"/>
+              <w:left w:val="single" w:color="BFC7D5" w:sz="4"/>
+              <w:bottom w:val="single" w:color="BFC7D5" w:sz="4"/>
+              <w:right w:val="single" w:color="BFC7D5" w:sz="4"/>
+            </w:tcBorders>
+            <w:tcMar>
+              <w:top w:type="dxa" w:w="50"/>
+              <w:left w:type="dxa" w:w="90"/>
+              <w:bottom w:type="dxa" w:w="50"/>
+              <w:right w:type="dxa" w:w="90"/>
+            </w:tcMar>
+          </w:tcPr>
+          <w:p>
+            <w:pPr>
+              <w:spacing w:after="20"/>
+            </w:pPr>
+            <w:r>
+              <w:rPr>
+                <w:sz w:val="19"/>
+                <w:szCs w:val="19"/>
+              </w:rPr>
+              <w:t xml:space="preserve">Démarrage solaire</w:t>
+            </w:r>
+          </w:p>
+        </w:tc>
+        <w:tc>
+          <w:tcPr>
+            <w:tcW w:type="dxa" w:w="4824"/>
+            <w:tcBorders>
+              <w:top w:val="single" w:color="BFC7D5" w:sz="4"/>
+              <w:left w:val="single" w:color="BFC7D5" w:sz="4"/>
+              <w:bottom w:val="single" w:color="BFC7D5" w:sz="4"/>
+              <w:right w:val="single" w:color="BFC7D5" w:sz="4"/>
+            </w:tcBorders>
+            <w:tcMar>
+              <w:top w:type="dxa" w:w="50"/>
+              <w:left w:type="dxa" w:w="90"/>
+              <w:bottom w:type="dxa" w:w="50"/>
+              <w:right w:type="dxa" w:w="90"/>
+            </w:tcMar>
+          </w:tcPr>
+          <w:p>
+            <w:pPr>
+              <w:spacing w:after="20"/>
+            </w:pPr>
+            <w:r>
+              <w:rPr>
+                <w:sz w:val="19"/>
+                <w:szCs w:val="19"/>
+              </w:rPr>
+              <w:t xml:space="preserve">SOLAIRE 10,1 s</w:t>
+            </w:r>
+          </w:p>
+        </w:tc>
+        <w:tc>
+          <w:tcPr>
+            <w:tcW w:type="dxa" w:w="1158"/>
+            <w:tcBorders>
+              <w:top w:val="single" w:color="BFC7D5" w:sz="4"/>
+              <w:left w:val="single" w:color="BFC7D5" w:sz="4"/>
+              <w:bottom w:val="single" w:color="BFC7D5" w:sz="4"/>
+              <w:right w:val="single" w:color="BFC7D5" w:sz="4"/>
+            </w:tcBorders>
+            <w:tcMar>
+              <w:top w:type="dxa" w:w="50"/>
+              <w:left w:type="dxa" w:w="90"/>
+              <w:bottom w:type="dxa" w:w="50"/>
+              <w:right w:type="dxa" w:w="90"/>
+            </w:tcMar>
+          </w:tcPr>
+          <w:p>
+            <w:pPr>
+              <w:spacing w:after="20"/>
+            </w:pPr>
+            <w:r>
+              <w:rPr>
+                <w:sz w:val="19"/>
+                <w:szCs w:val="19"/>
+              </w:rPr>
+              <w:t xml:space="preserve">0,1 s</w:t>
+            </w:r>
+          </w:p>
+        </w:tc>
+      </w:tr>
+      <w:tr>
+        <w:trPr>
+          <w:cantSplit/>
+        </w:trPr>
+        <w:tc>
+          <w:tcPr>
+            <w:tcW w:type="dxa" w:w="579"/>
+            <w:tcBorders>
+              <w:top w:val="single" w:color="BFC7D5" w:sz="4"/>
+              <w:left w:val="single" w:color="BFC7D5" w:sz="4"/>
+              <w:bottom w:val="single" w:color="BFC7D5" w:sz="4"/>
+              <w:right w:val="single" w:color="BFC7D5" w:sz="4"/>
+            </w:tcBorders>
+            <w:tcMar>
+              <w:top w:type="dxa" w:w="50"/>
+              <w:left w:type="dxa" w:w="90"/>
+              <w:bottom w:type="dxa" w:w="50"/>
+              <w:right w:type="dxa" w:w="90"/>
+            </w:tcMar>
+          </w:tcPr>
+          <w:p>
+            <w:pPr>
+              <w:spacing w:after="20"/>
+            </w:pPr>
+            <w:r>
+              <w:rPr>
+                <w:sz w:val="19"/>
+                <w:szCs w:val="19"/>
+              </w:rPr>
+              <w:t xml:space="preserve">3</w:t>
+            </w:r>
+          </w:p>
+        </w:tc>
+        <w:tc>
+          <w:tcPr>
+            <w:tcW w:type="dxa" w:w="2509"/>
+            <w:tcBorders>
+              <w:top w:val="single" w:color="BFC7D5" w:sz="4"/>
+              <w:left w:val="single" w:color="BFC7D5" w:sz="4"/>
+              <w:bottom w:val="single" w:color="BFC7D5" w:sz="4"/>
+              <w:right w:val="single" w:color="BFC7D5" w:sz="4"/>
+            </w:tcBorders>
+            <w:tcMar>
+              <w:top w:type="dxa" w:w="50"/>
+              <w:left w:type="dxa" w:w="90"/>
+              <w:bottom w:type="dxa" w:w="50"/>
+              <w:right w:type="dxa" w:w="90"/>
+            </w:tcMar>
+          </w:tcPr>
+          <w:p>
+            <w:pPr>
+              <w:spacing w:after="20"/>
+            </w:pPr>
+            <w:r>
+              <w:rPr>
+                <w:sz w:val="19"/>
+                <w:szCs w:val="19"/>
+              </w:rPr>
+              <w:t xml:space="preserve">Bascule H2 → GPL</w:t>
+            </w:r>
+          </w:p>
+        </w:tc>
+        <w:tc>
+          <w:tcPr>
+            <w:tcW w:type="dxa" w:w="4824"/>
+            <w:tcBorders>
+              <w:top w:val="single" w:color="BFC7D5" w:sz="4"/>
+              <w:left w:val="single" w:color="BFC7D5" w:sz="4"/>
+              <w:bottom w:val="single" w:color="BFC7D5" w:sz="4"/>
+              <w:right w:val="single" w:color="BFC7D5" w:sz="4"/>
+            </w:tcBorders>
+            <w:tcMar>
+              <w:top w:type="dxa" w:w="50"/>
+              <w:left w:type="dxa" w:w="90"/>
+              <w:bottom w:type="dxa" w:w="50"/>
+              <w:right w:type="dxa" w:w="90"/>
+            </w:tcMar>
+          </w:tcPr>
+          <w:p>
+            <w:pPr>
+              <w:spacing w:after="20"/>
+            </w:pPr>
+            <w:r>
+              <w:rPr>
+                <w:sz w:val="19"/>
+                <w:szCs w:val="19"/>
+              </w:rPr>
+              <w:t xml:space="preserve">H2 10,1 s → GPL 1250,1 s</w:t>
+            </w:r>
+          </w:p>
+        </w:tc>
+        <w:tc>
+          <w:tcPr>
+            <w:tcW w:type="dxa" w:w="1158"/>
+            <w:tcBorders>
+              <w:top w:val="single" w:color="BFC7D5" w:sz="4"/>
+              <w:left w:val="single" w:color="BFC7D5" w:sz="4"/>
+              <w:bottom w:val="single" w:color="BFC7D5" w:sz="4"/>
+              <w:right w:val="single" w:color="BFC7D5" w:sz="4"/>
+            </w:tcBorders>
+            <w:tcMar>
+              <w:top w:type="dxa" w:w="50"/>
+              <w:left w:type="dxa" w:w="90"/>
+              <w:bottom w:type="dxa" w:w="50"/>
+              <w:right w:type="dxa" w:w="90"/>
+            </w:tcMar>
+          </w:tcPr>
+          <w:p>
+            <w:pPr>
+              <w:spacing w:after="20"/>
+            </w:pPr>
+            <w:r>
+              <w:rPr>
+                <w:sz w:val="19"/>
+                <w:szCs w:val="19"/>
+              </w:rPr>
+              <w:t xml:space="preserve">0,1 s</w:t>
+            </w:r>
+          </w:p>
+        </w:tc>
+      </w:tr>
+      <w:tr>
+        <w:trPr>
+          <w:cantSplit/>
+        </w:trPr>
+        <w:tc>
+          <w:tcPr>
+            <w:tcW w:type="dxa" w:w="579"/>
+            <w:tcBorders>
+              <w:top w:val="single" w:color="BFC7D5" w:sz="4"/>
+              <w:left w:val="single" w:color="BFC7D5" w:sz="4"/>
+              <w:bottom w:val="single" w:color="BFC7D5" w:sz="4"/>
+              <w:right w:val="single" w:color="BFC7D5" w:sz="4"/>
+            </w:tcBorders>
+            <w:tcMar>
+              <w:top w:type="dxa" w:w="50"/>
+              <w:left w:type="dxa" w:w="90"/>
+              <w:bottom w:type="dxa" w:w="50"/>
+              <w:right w:type="dxa" w:w="90"/>
+            </w:tcMar>
+          </w:tcPr>
+          <w:p>
+            <w:pPr>
+              <w:spacing w:after="20"/>
+            </w:pPr>
+            <w:r>
+              <w:rPr>
+                <w:sz w:val="19"/>
+                <w:szCs w:val="19"/>
+              </w:rPr>
+              <w:t xml:space="preserve">4</w:t>
+            </w:r>
+          </w:p>
+        </w:tc>
+        <w:tc>
+          <w:tcPr>
+            <w:tcW w:type="dxa" w:w="2509"/>
+            <w:tcBorders>
+              <w:top w:val="single" w:color="BFC7D5" w:sz="4"/>
+              <w:left w:val="single" w:color="BFC7D5" w:sz="4"/>
+              <w:bottom w:val="single" w:color="BFC7D5" w:sz="4"/>
+              <w:right w:val="single" w:color="BFC7D5" w:sz="4"/>
+            </w:tcBorders>
+            <w:tcMar>
+              <w:top w:type="dxa" w:w="50"/>
+              <w:left w:type="dxa" w:w="90"/>
+              <w:bottom w:type="dxa" w:w="50"/>
+              <w:right w:type="dxa" w:w="90"/>
+            </w:tcMar>
+          </w:tcPr>
+          <w:p>
+            <w:pPr>
+              <w:spacing w:after="20"/>
+            </w:pPr>
+            <w:r>
+              <w:rPr>
+                <w:sz w:val="19"/>
+                <w:szCs w:val="19"/>
+              </w:rPr>
+              <w:t xml:space="preserve">Retour au solaire</w:t>
+            </w:r>
+          </w:p>
+        </w:tc>
+        <w:tc>
+          <w:tcPr>
+            <w:tcW w:type="dxa" w:w="4824"/>
+            <w:tcBorders>
+              <w:top w:val="single" w:color="BFC7D5" w:sz="4"/>
+              <w:left w:val="single" w:color="BFC7D5" w:sz="4"/>
+              <w:bottom w:val="single" w:color="BFC7D5" w:sz="4"/>
+              <w:right w:val="single" w:color="BFC7D5" w:sz="4"/>
+            </w:tcBorders>
+            <w:tcMar>
+              <w:top w:type="dxa" w:w="50"/>
+              <w:left w:type="dxa" w:w="90"/>
+              <w:bottom w:type="dxa" w:w="50"/>
+              <w:right w:type="dxa" w:w="90"/>
+            </w:tcMar>
+          </w:tcPr>
+          <w:p>
+            <w:pPr>
+              <w:spacing w:after="20"/>
+            </w:pPr>
+            <w:r>
+              <w:rPr>
+                <w:sz w:val="19"/>
+                <w:szCs w:val="19"/>
+              </w:rPr>
+              <w:t xml:space="preserve">H2 10,1 s → SOLAIRE 2160,1 s</w:t>
+            </w:r>
+          </w:p>
+        </w:tc>
+        <w:tc>
+          <w:tcPr>
+            <w:tcW w:type="dxa" w:w="1158"/>
+            <w:tcBorders>
+              <w:top w:val="single" w:color="BFC7D5" w:sz="4"/>
+              <w:left w:val="single" w:color="BFC7D5" w:sz="4"/>
+              <w:bottom w:val="single" w:color="BFC7D5" w:sz="4"/>
+              <w:right w:val="single" w:color="BFC7D5" w:sz="4"/>
+            </w:tcBorders>
+            <w:tcMar>
+              <w:top w:type="dxa" w:w="50"/>
+              <w:left w:type="dxa" w:w="90"/>
+              <w:bottom w:type="dxa" w:w="50"/>
+              <w:right w:type="dxa" w:w="90"/>
+            </w:tcMar>
+          </w:tcPr>
+          <w:p>
+            <w:pPr>
+              <w:spacing w:after="20"/>
+            </w:pPr>
+            <w:r>
+              <w:rPr>
+                <w:sz w:val="19"/>
+                <w:szCs w:val="19"/>
+              </w:rPr>
+              <w:t xml:space="preserve">0,1 s</w:t>
+            </w:r>
+          </w:p>
+        </w:tc>
+      </w:tr>
+      <w:tr>
+        <w:trPr>
+          <w:cantSplit/>
+        </w:trPr>
+        <w:tc>
+          <w:tcPr>
+            <w:tcW w:type="dxa" w:w="579"/>
+            <w:tcBorders>
+              <w:top w:val="single" w:color="BFC7D5" w:sz="4"/>
+              <w:left w:val="single" w:color="BFC7D5" w:sz="4"/>
+              <w:bottom w:val="single" w:color="BFC7D5" w:sz="4"/>
+              <w:right w:val="single" w:color="BFC7D5" w:sz="4"/>
+            </w:tcBorders>
+            <w:tcMar>
+              <w:top w:type="dxa" w:w="50"/>
+              <w:left w:type="dxa" w:w="90"/>
+              <w:bottom w:type="dxa" w:w="50"/>
+              <w:right w:type="dxa" w:w="90"/>
+            </w:tcMar>
+          </w:tcPr>
+          <w:p>
+            <w:pPr>
+              <w:spacing w:after="20"/>
+            </w:pPr>
+            <w:r>
+              <w:rPr>
+                <w:sz w:val="19"/>
+                <w:szCs w:val="19"/>
+              </w:rPr>
+              <w:t xml:space="preserve">5</w:t>
+            </w:r>
+          </w:p>
+        </w:tc>
+        <w:tc>
+          <w:tcPr>
+            <w:tcW w:type="dxa" w:w="2509"/>
+            <w:tcBorders>
+              <w:top w:val="single" w:color="BFC7D5" w:sz="4"/>
+              <w:left w:val="single" w:color="BFC7D5" w:sz="4"/>
+              <w:bottom w:val="single" w:color="BFC7D5" w:sz="4"/>
+              <w:right w:val="single" w:color="BFC7D5" w:sz="4"/>
+            </w:tcBorders>
+            <w:tcMar>
+              <w:top w:type="dxa" w:w="50"/>
+              <w:left w:type="dxa" w:w="90"/>
+              <w:bottom w:type="dxa" w:w="50"/>
+              <w:right w:type="dxa" w:w="90"/>
+            </w:tcMar>
+          </w:tcPr>
+          <w:p>
+            <w:pPr>
+              <w:spacing w:after="20"/>
+            </w:pPr>
+            <w:r>
+              <w:rPr>
+                <w:sz w:val="19"/>
+                <w:szCs w:val="19"/>
+              </w:rPr>
+              <w:t xml:space="preserve">Échecs d'allumage</w:t>
+            </w:r>
+          </w:p>
+        </w:tc>
+        <w:tc>
+          <w:tcPr>
+            <w:tcW w:type="dxa" w:w="4824"/>
+            <w:tcBorders>
+              <w:top w:val="single" w:color="BFC7D5" w:sz="4"/>
+              <w:left w:val="single" w:color="BFC7D5" w:sz="4"/>
+              <w:bottom w:val="single" w:color="BFC7D5" w:sz="4"/>
+              <w:right w:val="single" w:color="BFC7D5" w:sz="4"/>
+            </w:tcBorders>
+            <w:tcMar>
+              <w:top w:type="dxa" w:w="50"/>
+              <w:left w:type="dxa" w:w="90"/>
+              <w:bottom w:type="dxa" w:w="50"/>
+              <w:right w:type="dxa" w:w="90"/>
+            </w:tcMar>
+          </w:tcPr>
+          <w:p>
+            <w:pPr>
+              <w:spacing w:after="20"/>
+            </w:pPr>
+            <w:r>
+              <w:rPr>
+                <w:sz w:val="19"/>
+                <w:szCs w:val="19"/>
+              </w:rPr>
+              <w:t xml:space="preserve">H2 → ERREUR 382,1 s → H2 700,1 s</w:t>
+            </w:r>
+          </w:p>
+        </w:tc>
+        <w:tc>
+          <w:tcPr>
+            <w:tcW w:type="dxa" w:w="1158"/>
+            <w:tcBorders>
+              <w:top w:val="single" w:color="BFC7D5" w:sz="4"/>
+              <w:left w:val="single" w:color="BFC7D5" w:sz="4"/>
+              <w:bottom w:val="single" w:color="BFC7D5" w:sz="4"/>
+              <w:right w:val="single" w:color="BFC7D5" w:sz="4"/>
+            </w:tcBorders>
+            <w:tcMar>
+              <w:top w:type="dxa" w:w="50"/>
+              <w:left w:type="dxa" w:w="90"/>
+              <w:bottom w:type="dxa" w:w="50"/>
+              <w:right w:type="dxa" w:w="90"/>
+            </w:tcMar>
+          </w:tcPr>
+          <w:p>
+            <w:pPr>
+              <w:spacing w:after="20"/>
+            </w:pPr>
+            <w:r>
+              <w:rPr>
+                <w:sz w:val="19"/>
+                <w:szCs w:val="19"/>
+              </w:rPr>
+              <w:t xml:space="preserve">0,1 s</w:t>
+            </w:r>
+          </w:p>
+        </w:tc>
+      </w:tr>
+      <w:tr>
+        <w:trPr>
+          <w:cantSplit/>
+        </w:trPr>
+        <w:tc>
+          <w:tcPr>
+            <w:tcW w:type="dxa" w:w="579"/>
+            <w:tcBorders>
+              <w:top w:val="single" w:color="BFC7D5" w:sz="4"/>
+              <w:left w:val="single" w:color="BFC7D5" w:sz="4"/>
+              <w:bottom w:val="single" w:color="BFC7D5" w:sz="4"/>
+              <w:right w:val="single" w:color="BFC7D5" w:sz="4"/>
+            </w:tcBorders>
+            <w:tcMar>
+              <w:top w:type="dxa" w:w="50"/>
+              <w:left w:type="dxa" w:w="90"/>
+              <w:bottom w:type="dxa" w:w="50"/>
+              <w:right w:type="dxa" w:w="90"/>
+            </w:tcMar>
+          </w:tcPr>
+          <w:p>
+            <w:pPr>
+              <w:spacing w:after="20"/>
+            </w:pPr>
+            <w:r>
+              <w:rPr>
+                <w:sz w:val="19"/>
+                <w:szCs w:val="19"/>
+              </w:rPr>
+              <w:t xml:space="preserve">6</w:t>
+            </w:r>
+          </w:p>
+        </w:tc>
+        <w:tc>
+          <w:tcPr>
+            <w:tcW w:type="dxa" w:w="2509"/>
+            <w:tcBorders>
+              <w:top w:val="single" w:color="BFC7D5" w:sz="4"/>
+              <w:left w:val="single" w:color="BFC7D5" w:sz="4"/>
+              <w:bottom w:val="single" w:color="BFC7D5" w:sz="4"/>
+              <w:right w:val="single" w:color="BFC7D5" w:sz="4"/>
+            </w:tcBorders>
+            <w:tcMar>
+              <w:top w:type="dxa" w:w="50"/>
+              <w:left w:type="dxa" w:w="90"/>
+              <w:bottom w:type="dxa" w:w="50"/>
+              <w:right w:type="dxa" w:w="90"/>
+            </w:tcMar>
+          </w:tcPr>
+          <w:p>
+            <w:pPr>
+              <w:spacing w:after="20"/>
+            </w:pPr>
+            <w:r>
+              <w:rPr>
+                <w:sz w:val="19"/>
+                <w:szCs w:val="19"/>
+              </w:rPr>
+              <w:t xml:space="preserve">Pertes de flamme</w:t>
+            </w:r>
+          </w:p>
+        </w:tc>
+        <w:tc>
+          <w:tcPr>
+            <w:tcW w:type="dxa" w:w="4824"/>
+            <w:tcBorders>
+              <w:top w:val="single" w:color="BFC7D5" w:sz="4"/>
+              <w:left w:val="single" w:color="BFC7D5" w:sz="4"/>
+              <w:bottom w:val="single" w:color="BFC7D5" w:sz="4"/>
+              <w:right w:val="single" w:color="BFC7D5" w:sz="4"/>
+            </w:tcBorders>
+            <w:tcMar>
+              <w:top w:type="dxa" w:w="50"/>
+              <w:left w:type="dxa" w:w="90"/>
+              <w:bottom w:type="dxa" w:w="50"/>
+              <w:right w:type="dxa" w:w="90"/>
+            </w:tcMar>
+          </w:tcPr>
+          <w:p>
+            <w:pPr>
+              <w:spacing w:after="20"/>
+            </w:pPr>
+            <w:r>
+              <w:rPr>
+                <w:sz w:val="19"/>
+                <w:szCs w:val="19"/>
+              </w:rPr>
+              <w:t xml:space="preserve">H2 → URGENCE 700,0 s → ATTENTE 900,0 s</w:t>
+            </w:r>
+          </w:p>
+        </w:tc>
+        <w:tc>
+          <w:tcPr>
+            <w:tcW w:type="dxa" w:w="1158"/>
+            <w:tcBorders>
+              <w:top w:val="single" w:color="BFC7D5" w:sz="4"/>
+              <w:left w:val="single" w:color="BFC7D5" w:sz="4"/>
+              <w:bottom w:val="single" w:color="BFC7D5" w:sz="4"/>
+              <w:right w:val="single" w:color="BFC7D5" w:sz="4"/>
+            </w:tcBorders>
+            <w:tcMar>
+              <w:top w:type="dxa" w:w="50"/>
+              <w:left w:type="dxa" w:w="90"/>
+              <w:bottom w:type="dxa" w:w="50"/>
+              <w:right w:type="dxa" w:w="90"/>
+            </w:tcMar>
+          </w:tcPr>
+          <w:p>
+            <w:pPr>
+              <w:spacing w:after="20"/>
+            </w:pPr>
+            <w:r>
+              <w:rPr>
+                <w:sz w:val="19"/>
+                <w:szCs w:val="19"/>
+              </w:rPr>
+              <w:t xml:space="preserve">0,1 s</w:t>
+            </w:r>
+          </w:p>
+        </w:tc>
+      </w:tr>
+      <w:tr>
+        <w:trPr>
+          <w:cantSplit/>
+        </w:trPr>
+        <w:tc>
+          <w:tcPr>
+            <w:tcW w:type="dxa" w:w="579"/>
+            <w:tcBorders>
+              <w:top w:val="single" w:color="BFC7D5" w:sz="4"/>
+              <w:left w:val="single" w:color="BFC7D5" w:sz="4"/>
+              <w:bottom w:val="single" w:color="BFC7D5" w:sz="4"/>
+              <w:right w:val="single" w:color="BFC7D5" w:sz="4"/>
+            </w:tcBorders>
+            <w:tcMar>
+              <w:top w:type="dxa" w:w="50"/>
+              <w:left w:type="dxa" w:w="90"/>
+              <w:bottom w:type="dxa" w:w="50"/>
+              <w:right w:type="dxa" w:w="90"/>
+            </w:tcMar>
+          </w:tcPr>
+          <w:p>
+            <w:pPr>
+              <w:spacing w:after="20"/>
+            </w:pPr>
+            <w:r>
+              <w:rPr>
+                <w:sz w:val="19"/>
+                <w:szCs w:val="19"/>
+              </w:rPr>
+              <w:t xml:space="preserve">7</w:t>
+            </w:r>
+          </w:p>
+        </w:tc>
+        <w:tc>
+          <w:tcPr>
+            <w:tcW w:type="dxa" w:w="2509"/>
+            <w:tcBorders>
+              <w:top w:val="single" w:color="BFC7D5" w:sz="4"/>
+              <w:left w:val="single" w:color="BFC7D5" w:sz="4"/>
+              <w:bottom w:val="single" w:color="BFC7D5" w:sz="4"/>
+              <w:right w:val="single" w:color="BFC7D5" w:sz="4"/>
+            </w:tcBorders>
+            <w:tcMar>
+              <w:top w:type="dxa" w:w="50"/>
+              <w:left w:type="dxa" w:w="90"/>
+              <w:bottom w:type="dxa" w:w="50"/>
+              <w:right w:type="dxa" w:w="90"/>
+            </w:tcMar>
+          </w:tcPr>
+          <w:p>
+            <w:pPr>
+              <w:spacing w:after="20"/>
+            </w:pPr>
+            <w:r>
+              <w:rPr>
+                <w:sz w:val="19"/>
+                <w:szCs w:val="19"/>
+              </w:rPr>
+              <w:t xml:space="preserve">Fuite H2</w:t>
+            </w:r>
+          </w:p>
+        </w:tc>
+        <w:tc>
+          <w:tcPr>
+            <w:tcW w:type="dxa" w:w="4824"/>
+            <w:tcBorders>
+              <w:top w:val="single" w:color="BFC7D5" w:sz="4"/>
+              <w:left w:val="single" w:color="BFC7D5" w:sz="4"/>
+              <w:bottom w:val="single" w:color="BFC7D5" w:sz="4"/>
+              <w:right w:val="single" w:color="BFC7D5" w:sz="4"/>
+            </w:tcBorders>
+            <w:tcMar>
+              <w:top w:type="dxa" w:w="50"/>
+              <w:left w:type="dxa" w:w="90"/>
+              <w:bottom w:type="dxa" w:w="50"/>
+              <w:right w:type="dxa" w:w="90"/>
+            </w:tcMar>
+          </w:tcPr>
+          <w:p>
+            <w:pPr>
+              <w:spacing w:after="20"/>
+            </w:pPr>
+            <w:r>
+              <w:rPr>
+                <w:sz w:val="19"/>
+                <w:szCs w:val="19"/>
+              </w:rPr>
+              <w:t xml:space="preserve">H2 → URGENCE 1500 s → ATTENTE 1900 s → H2 2000,1 s</w:t>
+            </w:r>
+          </w:p>
+        </w:tc>
+        <w:tc>
+          <w:tcPr>
+            <w:tcW w:type="dxa" w:w="1158"/>
+            <w:tcBorders>
+              <w:top w:val="single" w:color="BFC7D5" w:sz="4"/>
+              <w:left w:val="single" w:color="BFC7D5" w:sz="4"/>
+              <w:bottom w:val="single" w:color="BFC7D5" w:sz="4"/>
+              <w:right w:val="single" w:color="BFC7D5" w:sz="4"/>
+            </w:tcBorders>
+            <w:tcMar>
+              <w:top w:type="dxa" w:w="50"/>
+              <w:left w:type="dxa" w:w="90"/>
+              <w:bottom w:type="dxa" w:w="50"/>
+              <w:right w:type="dxa" w:w="90"/>
+            </w:tcMar>
+          </w:tcPr>
+          <w:p>
+            <w:pPr>
+              <w:spacing w:after="20"/>
+            </w:pPr>
+            <w:r>
+              <w:rPr>
+                <w:sz w:val="19"/>
+                <w:szCs w:val="19"/>
+              </w:rPr>
+              <w:t xml:space="preserve">0,1 s</w:t>
+            </w:r>
+          </w:p>
+        </w:tc>
+      </w:tr>
+      <w:tr>
+        <w:trPr>
+          <w:cantSplit/>
+        </w:trPr>
+        <w:tc>
+          <w:tcPr>
+            <w:tcW w:type="dxa" w:w="579"/>
+            <w:tcBorders>
+              <w:top w:val="single" w:color="BFC7D5" w:sz="4"/>
+              <w:left w:val="single" w:color="BFC7D5" w:sz="4"/>
+              <w:bottom w:val="single" w:color="BFC7D5" w:sz="4"/>
+              <w:right w:val="single" w:color="BFC7D5" w:sz="4"/>
+            </w:tcBorders>
+            <w:tcMar>
+              <w:top w:type="dxa" w:w="50"/>
+              <w:left w:type="dxa" w:w="90"/>
+              <w:bottom w:type="dxa" w:w="50"/>
+              <w:right w:type="dxa" w:w="90"/>
+            </w:tcMar>
+          </w:tcPr>
+          <w:p>
+            <w:pPr>
+              <w:spacing w:after="20"/>
+            </w:pPr>
+            <w:r>
+              <w:rPr>
+                <w:sz w:val="19"/>
+                <w:szCs w:val="19"/>
+              </w:rPr>
+              <w:t xml:space="preserve">8</w:t>
+            </w:r>
+          </w:p>
+        </w:tc>
+        <w:tc>
+          <w:tcPr>
+            <w:tcW w:type="dxa" w:w="2509"/>
+            <w:tcBorders>
+              <w:top w:val="single" w:color="BFC7D5" w:sz="4"/>
+              <w:left w:val="single" w:color="BFC7D5" w:sz="4"/>
+              <w:bottom w:val="single" w:color="BFC7D5" w:sz="4"/>
+              <w:right w:val="single" w:color="BFC7D5" w:sz="4"/>
+            </w:tcBorders>
+            <w:tcMar>
+              <w:top w:type="dxa" w:w="50"/>
+              <w:left w:type="dxa" w:w="90"/>
+              <w:bottom w:type="dxa" w:w="50"/>
+              <w:right w:type="dxa" w:w="90"/>
+            </w:tcMar>
+          </w:tcPr>
+          <w:p>
+            <w:pPr>
+              <w:spacing w:after="20"/>
+            </w:pPr>
+            <w:r>
+              <w:rPr>
+                <w:sz w:val="19"/>
+                <w:szCs w:val="19"/>
+              </w:rPr>
+              <w:t xml:space="preserve">Fin par humidité</w:t>
+            </w:r>
+          </w:p>
+        </w:tc>
+        <w:tc>
+          <w:tcPr>
+            <w:tcW w:type="dxa" w:w="4824"/>
+            <w:tcBorders>
+              <w:top w:val="single" w:color="BFC7D5" w:sz="4"/>
+              <w:left w:val="single" w:color="BFC7D5" w:sz="4"/>
+              <w:bottom w:val="single" w:color="BFC7D5" w:sz="4"/>
+              <w:right w:val="single" w:color="BFC7D5" w:sz="4"/>
+            </w:tcBorders>
+            <w:tcMar>
+              <w:top w:type="dxa" w:w="50"/>
+              <w:left w:type="dxa" w:w="90"/>
+              <w:bottom w:type="dxa" w:w="50"/>
+              <w:right w:type="dxa" w:w="90"/>
+            </w:tcMar>
+          </w:tcPr>
+          <w:p>
+            <w:pPr>
+              <w:spacing w:after="20"/>
+            </w:pPr>
+            <w:r>
+              <w:rPr>
+                <w:sz w:val="19"/>
+                <w:szCs w:val="19"/>
+              </w:rPr>
+              <w:t xml:space="preserve">DEMANDE 7210,1 s → TERMINÉ 7510 s → ATTENTE 7810 s</w:t>
+            </w:r>
+          </w:p>
+        </w:tc>
+        <w:tc>
+          <w:tcPr>
+            <w:tcW w:type="dxa" w:w="1158"/>
+            <w:tcBorders>
+              <w:top w:val="single" w:color="BFC7D5" w:sz="4"/>
+              <w:left w:val="single" w:color="BFC7D5" w:sz="4"/>
+              <w:bottom w:val="single" w:color="BFC7D5" w:sz="4"/>
+              <w:right w:val="single" w:color="BFC7D5" w:sz="4"/>
+            </w:tcBorders>
+            <w:tcMar>
+              <w:top w:type="dxa" w:w="50"/>
+              <w:left w:type="dxa" w:w="90"/>
+              <w:bottom w:type="dxa" w:w="50"/>
+              <w:right w:type="dxa" w:w="90"/>
+            </w:tcMar>
+          </w:tcPr>
+          <w:p>
+            <w:pPr>
+              <w:spacing w:after="20"/>
+            </w:pPr>
+            <w:r>
+              <w:rPr>
+                <w:sz w:val="19"/>
+                <w:szCs w:val="19"/>
+              </w:rPr>
+              <w:t xml:space="preserve">0,1 s</w:t>
+            </w:r>
+          </w:p>
+        </w:tc>
+      </w:tr>
+      <w:tr>
+        <w:trPr>
+          <w:cantSplit/>
+        </w:trPr>
+        <w:tc>
+          <w:tcPr>
+            <w:tcW w:type="dxa" w:w="579"/>
+            <w:tcBorders>
+              <w:top w:val="single" w:color="BFC7D5" w:sz="4"/>
+              <w:left w:val="single" w:color="BFC7D5" w:sz="4"/>
+              <w:bottom w:val="single" w:color="BFC7D5" w:sz="4"/>
+              <w:right w:val="single" w:color="BFC7D5" w:sz="4"/>
+            </w:tcBorders>
+            <w:tcMar>
+              <w:top w:type="dxa" w:w="50"/>
+              <w:left w:type="dxa" w:w="90"/>
+              <w:bottom w:type="dxa" w:w="50"/>
+              <w:right w:type="dxa" w:w="90"/>
+            </w:tcMar>
+          </w:tcPr>
+          <w:p>
+            <w:pPr>
+              <w:spacing w:after="20"/>
+            </w:pPr>
+            <w:r>
+              <w:rPr>
+                <w:sz w:val="19"/>
+                <w:szCs w:val="19"/>
+              </w:rPr>
+              <w:t xml:space="preserve">9</w:t>
+            </w:r>
+          </w:p>
+        </w:tc>
+        <w:tc>
+          <w:tcPr>
+            <w:tcW w:type="dxa" w:w="2509"/>
+            <w:tcBorders>
+              <w:top w:val="single" w:color="BFC7D5" w:sz="4"/>
+              <w:left w:val="single" w:color="BFC7D5" w:sz="4"/>
+              <w:bottom w:val="single" w:color="BFC7D5" w:sz="4"/>
+              <w:right w:val="single" w:color="BFC7D5" w:sz="4"/>
+            </w:tcBorders>
+            <w:tcMar>
+              <w:top w:type="dxa" w:w="50"/>
+              <w:left w:type="dxa" w:w="90"/>
+              <w:bottom w:type="dxa" w:w="50"/>
+              <w:right w:type="dxa" w:w="90"/>
+            </w:tcMar>
+          </w:tcPr>
+          <w:p>
+            <w:pPr>
+              <w:spacing w:after="20"/>
+            </w:pPr>
+            <w:r>
+              <w:rPr>
+                <w:sz w:val="19"/>
+                <w:szCs w:val="19"/>
+              </w:rPr>
+              <w:t xml:space="preserve">Prolongation acceptée</w:t>
+            </w:r>
+          </w:p>
+        </w:tc>
+        <w:tc>
+          <w:tcPr>
+            <w:tcW w:type="dxa" w:w="4824"/>
+            <w:tcBorders>
+              <w:top w:val="single" w:color="BFC7D5" w:sz="4"/>
+              <w:left w:val="single" w:color="BFC7D5" w:sz="4"/>
+              <w:bottom w:val="single" w:color="BFC7D5" w:sz="4"/>
+              <w:right w:val="single" w:color="BFC7D5" w:sz="4"/>
+            </w:tcBorders>
+            <w:tcMar>
+              <w:top w:type="dxa" w:w="50"/>
+              <w:left w:type="dxa" w:w="90"/>
+              <w:bottom w:type="dxa" w:w="50"/>
+              <w:right w:type="dxa" w:w="90"/>
+            </w:tcMar>
+          </w:tcPr>
+          <w:p>
+            <w:pPr>
+              <w:spacing w:after="20"/>
+            </w:pPr>
+            <w:r>
+              <w:rPr>
+                <w:sz w:val="19"/>
+                <w:szCs w:val="19"/>
+              </w:rPr>
+              <w:t xml:space="preserve">DEMANDE 7210,1 s → PROLONG. 7300,1 s → DEMANDE 9100,1 s → TERMINÉ 9400 s</w:t>
+            </w:r>
+          </w:p>
+        </w:tc>
+        <w:tc>
+          <w:tcPr>
+            <w:tcW w:type="dxa" w:w="1158"/>
+            <w:tcBorders>
+              <w:top w:val="single" w:color="BFC7D5" w:sz="4"/>
+              <w:left w:val="single" w:color="BFC7D5" w:sz="4"/>
+              <w:bottom w:val="single" w:color="BFC7D5" w:sz="4"/>
+              <w:right w:val="single" w:color="BFC7D5" w:sz="4"/>
+            </w:tcBorders>
+            <w:tcMar>
+              <w:top w:type="dxa" w:w="50"/>
+              <w:left w:type="dxa" w:w="90"/>
+              <w:bottom w:type="dxa" w:w="50"/>
+              <w:right w:type="dxa" w:w="90"/>
+            </w:tcMar>
+          </w:tcPr>
+          <w:p>
+            <w:pPr>
+              <w:spacing w:after="20"/>
+            </w:pPr>
+            <w:r>
+              <w:rPr>
+                <w:sz w:val="19"/>
+                <w:szCs w:val="19"/>
+              </w:rPr>
+              <w:t xml:space="preserve">0,1 s</w:t>
+            </w:r>
+          </w:p>
+        </w:tc>
+      </w:tr>
+      <w:tr>
+        <w:trPr>
+          <w:cantSplit/>
+        </w:trPr>
+        <w:tc>
+          <w:tcPr>
+            <w:tcW w:type="dxa" w:w="579"/>
+            <w:tcBorders>
+              <w:top w:val="single" w:color="BFC7D5" w:sz="4"/>
+              <w:left w:val="single" w:color="BFC7D5" w:sz="4"/>
+              <w:bottom w:val="single" w:color="BFC7D5" w:sz="4"/>
+              <w:right w:val="single" w:color="BFC7D5" w:sz="4"/>
+            </w:tcBorders>
+            <w:tcMar>
+              <w:top w:type="dxa" w:w="50"/>
+              <w:left w:type="dxa" w:w="90"/>
+              <w:bottom w:type="dxa" w:w="50"/>
+              <w:right w:type="dxa" w:w="90"/>
+            </w:tcMar>
+          </w:tcPr>
+          <w:p>
+            <w:pPr>
+              <w:spacing w:after="20"/>
+            </w:pPr>
+            <w:r>
+              <w:rPr>
+                <w:sz w:val="19"/>
+                <w:szCs w:val="19"/>
+              </w:rPr>
+              <w:t xml:space="preserve">10</w:t>
+            </w:r>
+          </w:p>
+        </w:tc>
+        <w:tc>
+          <w:tcPr>
+            <w:tcW w:type="dxa" w:w="2509"/>
+            <w:tcBorders>
+              <w:top w:val="single" w:color="BFC7D5" w:sz="4"/>
+              <w:left w:val="single" w:color="BFC7D5" w:sz="4"/>
+              <w:bottom w:val="single" w:color="BFC7D5" w:sz="4"/>
+              <w:right w:val="single" w:color="BFC7D5" w:sz="4"/>
+            </w:tcBorders>
+            <w:tcMar>
+              <w:top w:type="dxa" w:w="50"/>
+              <w:left w:type="dxa" w:w="90"/>
+              <w:bottom w:type="dxa" w:w="50"/>
+              <w:right w:type="dxa" w:w="90"/>
+            </w:tcMar>
+          </w:tcPr>
+          <w:p>
+            <w:pPr>
+              <w:spacing w:after="20"/>
+            </w:pPr>
+            <w:r>
+              <w:rPr>
+                <w:sz w:val="19"/>
+                <w:szCs w:val="19"/>
+              </w:rPr>
+              <w:t xml:space="preserve">Humidité FIXE</w:t>
+            </w:r>
+          </w:p>
+        </w:tc>
+        <w:tc>
+          <w:tcPr>
+            <w:tcW w:type="dxa" w:w="4824"/>
+            <w:tcBorders>
+              <w:top w:val="single" w:color="BFC7D5" w:sz="4"/>
+              <w:left w:val="single" w:color="BFC7D5" w:sz="4"/>
+              <w:bottom w:val="single" w:color="BFC7D5" w:sz="4"/>
+              <w:right w:val="single" w:color="BFC7D5" w:sz="4"/>
+            </w:tcBorders>
+            <w:tcMar>
+              <w:top w:type="dxa" w:w="50"/>
+              <w:left w:type="dxa" w:w="90"/>
+              <w:bottom w:type="dxa" w:w="50"/>
+              <w:right w:type="dxa" w:w="90"/>
+            </w:tcMar>
+          </w:tcPr>
+          <w:p>
+            <w:pPr>
+              <w:spacing w:after="20"/>
+            </w:pPr>
+            <w:r>
+              <w:rPr>
+                <w:sz w:val="19"/>
+                <w:szCs w:val="19"/>
+              </w:rPr>
+              <w:t xml:space="preserve">DEMANDE 5410,1 s → TERMINÉ 5710 s → ATTENTE 6010 s</w:t>
+            </w:r>
+          </w:p>
+        </w:tc>
+        <w:tc>
+          <w:tcPr>
+            <w:tcW w:type="dxa" w:w="1158"/>
+            <w:tcBorders>
+              <w:top w:val="single" w:color="BFC7D5" w:sz="4"/>
+              <w:left w:val="single" w:color="BFC7D5" w:sz="4"/>
+              <w:bottom w:val="single" w:color="BFC7D5" w:sz="4"/>
+              <w:right w:val="single" w:color="BFC7D5" w:sz="4"/>
+            </w:tcBorders>
+            <w:tcMar>
+              <w:top w:type="dxa" w:w="50"/>
+              <w:left w:type="dxa" w:w="90"/>
+              <w:bottom w:type="dxa" w:w="50"/>
+              <w:right w:type="dxa" w:w="90"/>
+            </w:tcMar>
+          </w:tcPr>
+          <w:p>
+            <w:pPr>
+              <w:spacing w:after="20"/>
+            </w:pPr>
+            <w:r>
+              <w:rPr>
+                <w:sz w:val="19"/>
+                <w:szCs w:val="19"/>
+              </w:rPr>
+              <w:t xml:space="preserve">0,1 s</w:t>
+            </w:r>
+          </w:p>
+        </w:tc>
+      </w:tr>
+      <w:tr>
+        <w:trPr>
+          <w:cantSplit/>
+        </w:trPr>
+        <w:tc>
+          <w:tcPr>
+            <w:tcW w:type="dxa" w:w="579"/>
+            <w:tcBorders>
+              <w:top w:val="single" w:color="BFC7D5" w:sz="4"/>
+              <w:left w:val="single" w:color="BFC7D5" w:sz="4"/>
+              <w:bottom w:val="single" w:color="BFC7D5" w:sz="4"/>
+              <w:right w:val="single" w:color="BFC7D5" w:sz="4"/>
+            </w:tcBorders>
+            <w:tcMar>
+              <w:top w:type="dxa" w:w="50"/>
+              <w:left w:type="dxa" w:w="90"/>
+              <w:bottom w:type="dxa" w:w="50"/>
+              <w:right w:type="dxa" w:w="90"/>
+            </w:tcMar>
+          </w:tcPr>
+          <w:p>
+            <w:pPr>
+              <w:spacing w:after="20"/>
+            </w:pPr>
+            <w:r>
+              <w:rPr>
+                <w:sz w:val="19"/>
+                <w:szCs w:val="19"/>
+              </w:rPr>
+              <w:t xml:space="preserve">11</w:t>
+            </w:r>
+          </w:p>
+        </w:tc>
+        <w:tc>
+          <w:tcPr>
+            <w:tcW w:type="dxa" w:w="2509"/>
+            <w:tcBorders>
+              <w:top w:val="single" w:color="BFC7D5" w:sz="4"/>
+              <w:left w:val="single" w:color="BFC7D5" w:sz="4"/>
+              <w:bottom w:val="single" w:color="BFC7D5" w:sz="4"/>
+              <w:right w:val="single" w:color="BFC7D5" w:sz="4"/>
+            </w:tcBorders>
+            <w:tcMar>
+              <w:top w:type="dxa" w:w="50"/>
+              <w:left w:type="dxa" w:w="90"/>
+              <w:bottom w:type="dxa" w:w="50"/>
+              <w:right w:type="dxa" w:w="90"/>
+            </w:tcMar>
+          </w:tcPr>
+          <w:p>
+            <w:pPr>
+              <w:spacing w:after="20"/>
+            </w:pPr>
+            <w:r>
+              <w:rPr>
+                <w:sz w:val="19"/>
+                <w:szCs w:val="19"/>
+              </w:rPr>
+              <w:t xml:space="preserve">Palier imposé 33 %</w:t>
+            </w:r>
+          </w:p>
+        </w:tc>
+        <w:tc>
+          <w:tcPr>
+            <w:tcW w:type="dxa" w:w="4824"/>
+            <w:tcBorders>
+              <w:top w:val="single" w:color="BFC7D5" w:sz="4"/>
+              <w:left w:val="single" w:color="BFC7D5" w:sz="4"/>
+              <w:bottom w:val="single" w:color="BFC7D5" w:sz="4"/>
+              <w:right w:val="single" w:color="BFC7D5" w:sz="4"/>
+            </w:tcBorders>
+            <w:tcMar>
+              <w:top w:type="dxa" w:w="50"/>
+              <w:left w:type="dxa" w:w="90"/>
+              <w:bottom w:type="dxa" w:w="50"/>
+              <w:right w:type="dxa" w:w="90"/>
+            </w:tcMar>
+          </w:tcPr>
+          <w:p>
+            <w:pPr>
+              <w:spacing w:after="20"/>
+            </w:pPr>
+            <w:r>
+              <w:rPr>
+                <w:sz w:val="19"/>
+                <w:szCs w:val="19"/>
+              </w:rPr>
+              <w:t xml:space="preserve">TERMINÉ (90 °C) 1944,9 s → ATTENTE 2244,9 s</w:t>
+            </w:r>
+          </w:p>
+        </w:tc>
+        <w:tc>
+          <w:tcPr>
+            <w:tcW w:type="dxa" w:w="1158"/>
+            <w:tcBorders>
+              <w:top w:val="single" w:color="BFC7D5" w:sz="4"/>
+              <w:left w:val="single" w:color="BFC7D5" w:sz="4"/>
+              <w:bottom w:val="single" w:color="BFC7D5" w:sz="4"/>
+              <w:right w:val="single" w:color="BFC7D5" w:sz="4"/>
+            </w:tcBorders>
+            <w:tcMar>
+              <w:top w:type="dxa" w:w="50"/>
+              <w:left w:type="dxa" w:w="90"/>
+              <w:bottom w:type="dxa" w:w="50"/>
+              <w:right w:type="dxa" w:w="90"/>
+            </w:tcMar>
+          </w:tcPr>
+          <w:p>
+            <w:pPr>
+              <w:spacing w:after="20"/>
+            </w:pPr>
+            <w:r>
+              <w:rPr>
+                <w:sz w:val="19"/>
+                <w:szCs w:val="19"/>
+              </w:rPr>
+              <w:t xml:space="preserve">0,1 s</w:t>
+            </w:r>
+          </w:p>
+        </w:tc>
+      </w:tr>
+      <w:tr>
+        <w:trPr>
+          <w:cantSplit/>
+        </w:trPr>
+        <w:tc>
+          <w:tcPr>
+            <w:tcW w:type="dxa" w:w="579"/>
+            <w:tcBorders>
+              <w:top w:val="single" w:color="BFC7D5" w:sz="4"/>
+              <w:left w:val="single" w:color="BFC7D5" w:sz="4"/>
+              <w:bottom w:val="single" w:color="BFC7D5" w:sz="4"/>
+              <w:right w:val="single" w:color="BFC7D5" w:sz="4"/>
+            </w:tcBorders>
+            <w:tcMar>
+              <w:top w:type="dxa" w:w="50"/>
+              <w:left w:type="dxa" w:w="90"/>
+              <w:bottom w:type="dxa" w:w="50"/>
+              <w:right w:type="dxa" w:w="90"/>
+            </w:tcMar>
+          </w:tcPr>
+          <w:p>
+            <w:pPr>
+              <w:spacing w:after="20"/>
+            </w:pPr>
+            <w:r>
+              <w:rPr>
+                <w:sz w:val="19"/>
+                <w:szCs w:val="19"/>
+              </w:rPr>
+              <w:t xml:space="preserve">12</w:t>
+            </w:r>
+          </w:p>
+        </w:tc>
+        <w:tc>
+          <w:tcPr>
+            <w:tcW w:type="dxa" w:w="2509"/>
+            <w:tcBorders>
+              <w:top w:val="single" w:color="BFC7D5" w:sz="4"/>
+              <w:left w:val="single" w:color="BFC7D5" w:sz="4"/>
+              <w:bottom w:val="single" w:color="BFC7D5" w:sz="4"/>
+              <w:right w:val="single" w:color="BFC7D5" w:sz="4"/>
+            </w:tcBorders>
+            <w:tcMar>
+              <w:top w:type="dxa" w:w="50"/>
+              <w:left w:type="dxa" w:w="90"/>
+              <w:bottom w:type="dxa" w:w="50"/>
+              <w:right w:type="dxa" w:w="90"/>
+            </w:tcMar>
+          </w:tcPr>
+          <w:p>
+            <w:pPr>
+              <w:spacing w:after="20"/>
+            </w:pPr>
+            <w:r>
+              <w:rPr>
+                <w:sz w:val="19"/>
+                <w:szCs w:val="19"/>
+              </w:rPr>
+              <w:t xml:space="preserve">Surchauffe (100 % imposé)</w:t>
+            </w:r>
+          </w:p>
+        </w:tc>
+        <w:tc>
+          <w:tcPr>
+            <w:tcW w:type="dxa" w:w="4824"/>
+            <w:tcBorders>
+              <w:top w:val="single" w:color="BFC7D5" w:sz="4"/>
+              <w:left w:val="single" w:color="BFC7D5" w:sz="4"/>
+              <w:bottom w:val="single" w:color="BFC7D5" w:sz="4"/>
+              <w:right w:val="single" w:color="BFC7D5" w:sz="4"/>
+            </w:tcBorders>
+            <w:tcMar>
+              <w:top w:type="dxa" w:w="50"/>
+              <w:left w:type="dxa" w:w="90"/>
+              <w:bottom w:type="dxa" w:w="50"/>
+              <w:right w:type="dxa" w:w="90"/>
+            </w:tcMar>
+          </w:tcPr>
+          <w:p>
+            <w:pPr>
+              <w:spacing w:after="20"/>
+            </w:pPr>
+            <w:r>
+              <w:rPr>
+                <w:sz w:val="19"/>
+                <w:szCs w:val="19"/>
+              </w:rPr>
+              <w:t xml:space="preserve">TERMINÉ (90 °C) 632,4 s → ATTENTE 932,4 s</w:t>
+            </w:r>
+          </w:p>
+        </w:tc>
+        <w:tc>
+          <w:tcPr>
+            <w:tcW w:type="dxa" w:w="1158"/>
+            <w:tcBorders>
+              <w:top w:val="single" w:color="BFC7D5" w:sz="4"/>
+              <w:left w:val="single" w:color="BFC7D5" w:sz="4"/>
+              <w:bottom w:val="single" w:color="BFC7D5" w:sz="4"/>
+              <w:right w:val="single" w:color="BFC7D5" w:sz="4"/>
+            </w:tcBorders>
+            <w:tcMar>
+              <w:top w:type="dxa" w:w="50"/>
+              <w:left w:type="dxa" w:w="90"/>
+              <w:bottom w:type="dxa" w:w="50"/>
+              <w:right w:type="dxa" w:w="90"/>
+            </w:tcMar>
+          </w:tcPr>
+          <w:p>
+            <w:pPr>
+              <w:spacing w:after="20"/>
+            </w:pPr>
+            <w:r>
+              <w:rPr>
+                <w:sz w:val="19"/>
+                <w:szCs w:val="19"/>
+              </w:rPr>
+              <w:t xml:space="preserve">0,6 s</w:t>
+            </w:r>
+          </w:p>
+        </w:tc>
+      </w:tr>
+    </w:tbl>
+    <w:p>
+      <w:pPr>
+        <w:spacing w:after="200" w:before="60"/>
+        <w:jc w:val="center"/>
+      </w:pPr>
+      <w:r>
+        <w:rPr>
+          <w:i/>
+          <w:iCs/>
+          <w:color w:val="4A5568"/>
+          <w:sz w:val="19"/>
+          <w:szCs w:val="19"/>
+        </w:rPr>
+        <w:t xml:space="preserve">Tableau 29 : Validation croisée Simulink / firmware (12 scénarios)</w:t>
+      </w:r>
+    </w:p>
+    <w:p>
+      <w:pPr>
+        <w:spacing w:after="120" w:line="276"/>
+        <w:jc w:val="both"/>
+      </w:pPr>
+      <w:r>
+        <w:t xml:space="preserve">L'écart de 0,1 s correspond au pas de calcul du chart. Les instants de changement de palier s'écartent au plus d'environ 4 s par cycle de veille (14 s après une heure dans le scénario 1) : le firmware lit la sonde T_sec une fois par seconde avec une conversion asynchrone du DS18B20, alors que Simulink la lit tous les 0,1 s ; ce retard de mesure prolonge légèrement chaque veille. La séquence des états reste identique : </w:t>
+      </w:r>
+      <w:r>
+        <w:rPr>
+          <w:b/>
+          <w:bCs/>
+        </w:rPr>
+        <w:t xml:space="preserve">le modèle Stateflow reproduit le programme Arduino</w:t>
+      </w:r>
+      <w:r>
+        <w:t xml:space="preserve">.</w:t>
       </w:r>
     </w:p>
     <w:p>
@@ -31622,19 +33278,7 @@
         <w:jc w:val="left"/>
       </w:pPr>
       <w:r>
-        <w:t xml:space="preserve">Exécution des scripts dans MATLAB/Simulink, puis comparaison des douze scénarios avec la référence du firmware (</w:t>
-      </w:r>
-      <w:r>
-        <w:rPr>
-          <w:rFonts w:ascii="Consolas" w:cs="Consolas" w:eastAsia="Consolas" w:hAnsi="Consolas"/>
-          <w:color w:val="1F3864"/>
-          <w:sz w:val="20"/>
-          <w:szCs w:val="20"/>
-        </w:rPr>
-        <w:t xml:space="preserve">comparer_scenario</w:t>
-      </w:r>
-      <w:r>
-        <w:t xml:space="preserve">).</w:t>
+        <w:t xml:space="preserve">Identification du modèle thermique et du modèle de séchage sur le prototype (les paramètres actuels sont ceux du chapitre 3 et un modèle de séchage illustratif).</w:t>
       </w:r>
     </w:p>
     <w:p>
@@ -33124,7 +34768,7 @@
           <w:sz w:val="19"/>
           <w:szCs w:val="19"/>
         </w:rPr>
-        <w:t xml:space="preserve">Tableau 29 : Logiciels, bibliothèques et outils</w:t>
+        <w:t xml:space="preserve">Tableau 30 : Logiciels, bibliothèques et outils</w:t>
       </w:r>
     </w:p>
     <w:p>
@@ -33446,7 +35090,7 @@
       <w:r>
         <w:t xml:space="preserve"> </w:t>
       </w:r>
-      <w:hyperlink w:history="1" r:id="rIdzsuw7pedhgdnxsmrcrk0_">
+      <w:hyperlink w:history="1" r:id="rIdcstd_zohoweakx66svuvi">
         <w:r>
           <w:rPr>
             <w:rStyle w:val="Hyperlink"/>
@@ -33486,7 +35130,7 @@
       <w:r>
         <w:t xml:space="preserve"> </w:t>
       </w:r>
-      <w:hyperlink w:history="1" r:id="rIdkcmsih2_tf1iauj__hcov">
+      <w:hyperlink w:history="1" r:id="rIdrjrmoe6etoeiwry2zjk9b">
         <w:r>
           <w:rPr>
             <w:rStyle w:val="Hyperlink"/>
@@ -33526,7 +35170,7 @@
       <w:r>
         <w:t xml:space="preserve"> </w:t>
       </w:r>
-      <w:hyperlink w:history="1" r:id="rId1tcf_tzcrqn6ltq2jskj4">
+      <w:hyperlink w:history="1" r:id="rIdt1vkqorne5srd7gkv4zsm">
         <w:r>
           <w:rPr>
             <w:rStyle w:val="Hyperlink"/>
@@ -33566,7 +35210,7 @@
       <w:r>
         <w:t xml:space="preserve"> </w:t>
       </w:r>
-      <w:hyperlink w:history="1" r:id="rIdv3mrjirc-jdovyozqlcmw">
+      <w:hyperlink w:history="1" r:id="rId3pawkykovsf0utbcwoxj6">
         <w:r>
           <w:rPr>
             <w:rStyle w:val="Hyperlink"/>
@@ -33606,7 +35250,7 @@
       <w:r>
         <w:t xml:space="preserve"> </w:t>
       </w:r>
-      <w:hyperlink w:history="1" r:id="rIdtfyvtwwumfveu092-nizp">
+      <w:hyperlink w:history="1" r:id="rIdqwlhl_kti5dz1k-tnghpp">
         <w:r>
           <w:rPr>
             <w:rStyle w:val="Hyperlink"/>
@@ -33646,7 +35290,7 @@
       <w:r>
         <w:t xml:space="preserve"> </w:t>
       </w:r>
-      <w:hyperlink w:history="1" r:id="rIdqwp2h5hkwcz7etjveitke">
+      <w:hyperlink w:history="1" r:id="rIdvod6lszckgtwswhzeqojw">
         <w:r>
           <w:rPr>
             <w:rStyle w:val="Hyperlink"/>
@@ -33686,7 +35330,7 @@
       <w:r>
         <w:t xml:space="preserve"> </w:t>
       </w:r>
-      <w:hyperlink w:history="1" r:id="rIdxdd5786z2ngmz46orgz6n">
+      <w:hyperlink w:history="1" r:id="rIdvuy_p7ylthiulav5idenh">
         <w:r>
           <w:rPr>
             <w:rStyle w:val="Hyperlink"/>
@@ -33726,7 +35370,7 @@
       <w:r>
         <w:t xml:space="preserve"> </w:t>
       </w:r>
-      <w:hyperlink w:history="1" r:id="rIdbr8iopzm6hzkuw0k85zjg">
+      <w:hyperlink w:history="1" r:id="rIdkfulszww1bgkfnx0sus7a">
         <w:r>
           <w:rPr>
             <w:rStyle w:val="Hyperlink"/>
@@ -33766,7 +35410,7 @@
       <w:r>
         <w:t xml:space="preserve"> </w:t>
       </w:r>
-      <w:hyperlink w:history="1" r:id="rId4v580w5hmdqpjc6jzzqrh">
+      <w:hyperlink w:history="1" r:id="rIdhugmrk_88ylbkrobmqymb">
         <w:r>
           <w:rPr>
             <w:rStyle w:val="Hyperlink"/>
@@ -33816,7 +35460,7 @@
       <w:r>
         <w:t xml:space="preserve"> </w:t>
       </w:r>
-      <w:hyperlink w:history="1" r:id="rIdned9pejm8gaksmxq39tod">
+      <w:hyperlink w:history="1" r:id="rIdaxh9jqv37m60hiboz87fb">
         <w:r>
           <w:rPr>
             <w:rStyle w:val="Hyperlink"/>
@@ -33856,7 +35500,7 @@
       <w:r>
         <w:t xml:space="preserve"> </w:t>
       </w:r>
-      <w:hyperlink w:history="1" r:id="rId-r2fmmwwluvo_2lzp2y2_">
+      <w:hyperlink w:history="1" r:id="rIdiferunmgs-wgs7yczqrr2">
         <w:r>
           <w:rPr>
             <w:rStyle w:val="Hyperlink"/>
@@ -33896,7 +35540,7 @@
       <w:r>
         <w:t xml:space="preserve"> </w:t>
       </w:r>
-      <w:hyperlink w:history="1" r:id="rIduj0eajjk9jkvo8dp-f6na">
+      <w:hyperlink w:history="1" r:id="rIdhznuhnvrixjy8f9wwzqxz">
         <w:r>
           <w:rPr>
             <w:rStyle w:val="Hyperlink"/>
@@ -33926,7 +35570,7 @@
       <w:r>
         <w:t xml:space="preserve"> </w:t>
       </w:r>
-      <w:hyperlink w:history="1" r:id="rIdgfhs6sgxzt040taw8e1dj">
+      <w:hyperlink w:history="1" r:id="rIdkevhuv8addedqha_vhdm2">
         <w:r>
           <w:rPr>
             <w:rStyle w:val="Hyperlink"/>
@@ -34020,7 +35664,7 @@
       <w:r>
         <w:t xml:space="preserve"> </w:t>
       </w:r>
-      <w:hyperlink w:history="1" r:id="rIdf_gsrpatfu2qctnqpbjoc">
+      <w:hyperlink w:history="1" r:id="rId3xvm5g4fx2kgbapl2tlkq">
         <w:r>
           <w:rPr>
             <w:rStyle w:val="Hyperlink"/>
@@ -34060,7 +35704,7 @@
       <w:r>
         <w:t xml:space="preserve"> </w:t>
       </w:r>
-      <w:hyperlink w:history="1" r:id="rIdi3b5bnv3dfpqppkio1hpc">
+      <w:hyperlink w:history="1" r:id="rId__si5dnke5mktupmy8zzl">
         <w:r>
           <w:rPr>
             <w:rStyle w:val="Hyperlink"/>
@@ -34100,7 +35744,7 @@
       <w:r>
         <w:t xml:space="preserve"> </w:t>
       </w:r>
-      <w:hyperlink w:history="1" r:id="rIddwhdld1o2jym-i-fd1tfc">
+      <w:hyperlink w:history="1" r:id="rIdhkoqw3kifcrrjwo0peeml">
         <w:r>
           <w:rPr>
             <w:rStyle w:val="Hyperlink"/>
@@ -34130,7 +35774,7 @@
       <w:r>
         <w:t xml:space="preserve"> </w:t>
       </w:r>
-      <w:hyperlink w:history="1" r:id="rIdgsdylkekhwc4qekria8oh">
+      <w:hyperlink w:history="1" r:id="rId9khyny-nbcqgrepabghyp">
         <w:r>
           <w:rPr>
             <w:rStyle w:val="Hyperlink"/>
@@ -34160,7 +35804,7 @@
       <w:r>
         <w:t xml:space="preserve"> </w:t>
       </w:r>
-      <w:hyperlink w:history="1" r:id="rIdtxaf27d-jtynidwj2pp3q">
+      <w:hyperlink w:history="1" r:id="rIdgrwu2jpxu3wsbxbbrrv-3">
         <w:r>
           <w:rPr>
             <w:rStyle w:val="Hyperlink"/>
@@ -34190,7 +35834,7 @@
       <w:r>
         <w:t xml:space="preserve"> </w:t>
       </w:r>
-      <w:hyperlink w:history="1" r:id="rId9pyxut036zcn51zhbo5dk">
+      <w:hyperlink w:history="1" r:id="rIdagupp2jbrzgy5iwbqfbqh">
         <w:r>
           <w:rPr>
             <w:rStyle w:val="Hyperlink"/>
@@ -34220,7 +35864,7 @@
       <w:r>
         <w:t xml:space="preserve"> </w:t>
       </w:r>
-      <w:hyperlink w:history="1" r:id="rIdiry_fvruq1t9nxz10oszy">
+      <w:hyperlink w:history="1" r:id="rId-8fl32tznrg8aug8polly">
         <w:r>
           <w:rPr>
             <w:rStyle w:val="Hyperlink"/>
@@ -34260,7 +35904,7 @@
       <w:r>
         <w:t xml:space="preserve"> </w:t>
       </w:r>
-      <w:hyperlink w:history="1" r:id="rIdoqu6dkhorkiutguztcv5h">
+      <w:hyperlink w:history="1" r:id="rIdcdsv7ygno4lfw57-hxsvi">
         <w:r>
           <w:rPr>
             <w:rStyle w:val="Hyperlink"/>
@@ -34290,7 +35934,7 @@
       <w:r>
         <w:t xml:space="preserve"> </w:t>
       </w:r>
-      <w:hyperlink w:history="1" r:id="rIdwgyblctefrklmr0xybxzr">
+      <w:hyperlink w:history="1" r:id="rIdterwat1tyczxvvp1wyh0u">
         <w:r>
           <w:rPr>
             <w:rStyle w:val="Hyperlink"/>
@@ -34320,7 +35964,7 @@
       <w:r>
         <w:t xml:space="preserve"> </w:t>
       </w:r>
-      <w:hyperlink w:history="1" r:id="rIdavfrq3rrkdxebdlsvh75x">
+      <w:hyperlink w:history="1" r:id="rIdxmy94eq8qwpxynwxejaa_">
         <w:r>
           <w:rPr>
             <w:rStyle w:val="Hyperlink"/>
@@ -34350,7 +35994,7 @@
       <w:r>
         <w:t xml:space="preserve"> </w:t>
       </w:r>
-      <w:hyperlink w:history="1" r:id="rIdcgxzyskgny_e2q5j4fxxn">
+      <w:hyperlink w:history="1" r:id="rIdyadkddjqhlgmzsdcxho4j">
         <w:r>
           <w:rPr>
             <w:rStyle w:val="Hyperlink"/>
@@ -34380,7 +36024,7 @@
       <w:r>
         <w:t xml:space="preserve"> </w:t>
       </w:r>
-      <w:hyperlink w:history="1" r:id="rIdhizkmlfogvjbkjl83wlk5">
+      <w:hyperlink w:history="1" r:id="rIdimyvngy7wxa49qjaixun1">
         <w:r>
           <w:rPr>
             <w:rStyle w:val="Hyperlink"/>
@@ -34410,7 +36054,7 @@
       <w:r>
         <w:t xml:space="preserve"> </w:t>
       </w:r>
-      <w:hyperlink w:history="1" r:id="rIdrsl0wqbajk_eui3i9iagj">
+      <w:hyperlink w:history="1" r:id="rIdndh2tqppuxikgh5iylu7t">
         <w:r>
           <w:rPr>
             <w:rStyle w:val="Hyperlink"/>
@@ -34440,7 +36084,7 @@
       <w:r>
         <w:t xml:space="preserve"> </w:t>
       </w:r>
-      <w:hyperlink w:history="1" r:id="rIdn7eybsepuyp5p43sxlzzi">
+      <w:hyperlink w:history="1" r:id="rIdcbasjazql3cawp_xfcek1">
         <w:r>
           <w:rPr>
             <w:rStyle w:val="Hyperlink"/>
@@ -34470,7 +36114,7 @@
       <w:r>
         <w:t xml:space="preserve"> </w:t>
       </w:r>
-      <w:hyperlink w:history="1" r:id="rIdp5eij-pihgssuqdhca-ak">
+      <w:hyperlink w:history="1" r:id="rIdhpw3wcvcccbjeyqaiqr6o">
         <w:r>
           <w:rPr>
             <w:rStyle w:val="Hyperlink"/>
@@ -34500,7 +36144,7 @@
       <w:r>
         <w:t xml:space="preserve"> </w:t>
       </w:r>
-      <w:hyperlink w:history="1" r:id="rIdp3fdc9eirweore30y1xuf">
+      <w:hyperlink w:history="1" r:id="rIda5ul4oiui-tmb19psovff">
         <w:r>
           <w:rPr>
             <w:rStyle w:val="Hyperlink"/>
@@ -34540,7 +36184,7 @@
       <w:r>
         <w:t xml:space="preserve"> </w:t>
       </w:r>
-      <w:hyperlink w:history="1" r:id="rIdn2lyska6k3sptyslngjmi">
+      <w:hyperlink w:history="1" r:id="rId-w9hvlfklmztzlduk-njm">
         <w:r>
           <w:rPr>
             <w:rStyle w:val="Hyperlink"/>
@@ -34570,7 +36214,7 @@
       <w:r>
         <w:t xml:space="preserve"> </w:t>
       </w:r>
-      <w:hyperlink w:history="1" r:id="rId-ae2-510itupqe1tu5nqx">
+      <w:hyperlink w:history="1" r:id="rIdq9svglx-j99szvgn5gwv_">
         <w:r>
           <w:rPr>
             <w:rStyle w:val="Hyperlink"/>
@@ -34600,7 +36244,7 @@
       <w:r>
         <w:t xml:space="preserve"> </w:t>
       </w:r>
-      <w:hyperlink w:history="1" r:id="rIdvlxawydm2wo6pnjupjgyg">
+      <w:hyperlink w:history="1" r:id="rIdcszmzkc0d4yko0z6wbiit">
         <w:r>
           <w:rPr>
             <w:rStyle w:val="Hyperlink"/>
@@ -34640,7 +36284,7 @@
       <w:r>
         <w:t xml:space="preserve"> </w:t>
       </w:r>
-      <w:hyperlink w:history="1" r:id="rIdq_feo6kmtpisptylgbslg">
+      <w:hyperlink w:history="1" r:id="rIdkwydu3kftnok_kck1_e_3">
         <w:r>
           <w:rPr>
             <w:rStyle w:val="Hyperlink"/>
@@ -36582,7 +38226,7 @@
           <w:sz w:val="19"/>
           <w:szCs w:val="19"/>
         </w:rPr>
-        <w:t xml:space="preserve">Tableau 30 : Brochage complet</w:t>
+        <w:t xml:space="preserve">Tableau 31 : Brochage complet</w:t>
       </w:r>
     </w:p>
     <w:p>
@@ -37389,7 +39033,7 @@
           <w:sz w:val="19"/>
           <w:szCs w:val="19"/>
         </w:rPr>
-        <w:t xml:space="preserve">Tableau 31 : Glossaire</w:t>
+        <w:t xml:space="preserve">Tableau 32 : Glossaire</w:t>
       </w:r>
     </w:p>
     <w:sectPr>

</xml_diff>